<commit_message>
Minor changes to several documents
Changes made during Autumn 2025
</commit_message>
<xml_diff>
--- a/Chap/OOProg01/OOProg01.docx
+++ b/Chap/OOProg01/OOProg01.docx
@@ -1,7 +1,9 @@
 
 <file path=word/document.xml><?xml version="1.0" encoding="utf-8"?>
-<w:document xmlns:wpc="http://schemas.microsoft.com/office/word/2010/wordprocessingCanvas" xmlns:cx="http://schemas.microsoft.com/office/drawing/2014/chartex" xmlns:cx1="http://schemas.microsoft.com/office/drawing/2015/9/8/chartex" xmlns:cx2="http://schemas.microsoft.com/office/drawing/2015/10/21/chartex" xmlns:cx3="http://schemas.microsoft.com/office/drawing/2016/5/9/chartex" xmlns:cx4="http://schemas.microsoft.com/office/drawing/2016/5/10/chartex" xmlns:cx5="http://schemas.microsoft.com/office/drawing/2016/5/11/chartex" xmlns:cx6="http://schemas.microsoft.com/office/drawing/2016/5/12/chartex" xmlns:cx7="http://schemas.microsoft.com/office/drawing/2016/5/13/chartex" xmlns:cx8="http://schemas.microsoft.com/office/drawing/2016/5/14/chartex" xmlns:mc="http://schemas.openxmlformats.org/markup-compatibility/2006" xmlns:aink="http://schemas.microsoft.com/office/drawing/2016/ink" xmlns:am3d="http://schemas.microsoft.com/office/drawing/2017/model3d" xmlns:o="urn:schemas-microsoft-com:office:office" xmlns:oel="http://schemas.microsoft.com/office/2019/extlst" xmlns:r="http://schemas.openxmlformats.org/officeDocument/2006/relationships" xmlns:m="http://schemas.openxmlformats.org/officeDocument/2006/math" xmlns:v="urn:schemas-microsoft-com:vml" xmlns:wp14="http://schemas.microsoft.com/office/word/2010/wordprocessingDrawing" xmlns:wp="http://schemas.openxmlformats.org/drawingml/2006/wordprocessingDrawing" xmlns:w10="urn:schemas-microsoft-com:office:word" xmlns:w="http://schemas.openxmlformats.org/wordprocessingml/2006/main" xmlns:w14="http://schemas.microsoft.com/office/word/2010/wordml" xmlns:w15="http://schemas.microsoft.com/office/word/2012/wordml" xmlns:w16cex="http://schemas.microsoft.com/office/word/2018/wordml/cex" xmlns:w16cid="http://schemas.microsoft.com/office/word/2016/wordml/cid" xmlns:w16="http://schemas.microsoft.com/office/word/2018/wordml" xmlns:w16du="http://schemas.microsoft.com/office/word/2023/wordml/word16du" xmlns:w16sdtdh="http://schemas.microsoft.com/office/word/2020/wordml/sdtdatahash" xmlns:w16sdtfl="http://schemas.microsoft.com/office/word/2024/wordml/sdtformatlock" xmlns:w16se="http://schemas.microsoft.com/office/word/2015/wordml/symex" xmlns:wpg="http://schemas.microsoft.com/office/word/2010/wordprocessingGroup" xmlns:wpi="http://schemas.microsoft.com/office/word/2010/wordprocessingInk" xmlns:wne="http://schemas.microsoft.com/office/word/2006/wordml" xmlns:wps="http://schemas.microsoft.com/office/word/2010/wordprocessingShape" mc:Ignorable="w14 w15 w16se w16cid w16 w16cex w16sdtdh w16sdtfl w16du wp14">
+<w:document xmlns:wpc="http://schemas.microsoft.com/office/word/2010/wordprocessingCanvas" xmlns:cx="http://schemas.microsoft.com/office/drawing/2014/chartex" xmlns:cx1="http://schemas.microsoft.com/office/drawing/2015/9/8/chartex" xmlns:cx2="http://schemas.microsoft.com/office/drawing/2015/10/21/chartex" xmlns:cx3="http://schemas.microsoft.com/office/drawing/2016/5/9/chartex" xmlns:cx4="http://schemas.microsoft.com/office/drawing/2016/5/10/chartex" xmlns:cx5="http://schemas.microsoft.com/office/drawing/2016/5/11/chartex" xmlns:cx6="http://schemas.microsoft.com/office/drawing/2016/5/12/chartex" xmlns:cx7="http://schemas.microsoft.com/office/drawing/2016/5/13/chartex" xmlns:cx8="http://schemas.microsoft.com/office/drawing/2016/5/14/chartex" xmlns:mc="http://schemas.openxmlformats.org/markup-compatibility/2006" xmlns:aink="http://schemas.microsoft.com/office/drawing/2016/ink" xmlns:am3d="http://schemas.microsoft.com/office/drawing/2017/model3d" xmlns:o="urn:schemas-microsoft-com:office:office" xmlns:r="http://schemas.openxmlformats.org/officeDocument/2006/relationships" xmlns:m="http://schemas.openxmlformats.org/officeDocument/2006/math" xmlns:v="urn:schemas-microsoft-com:vml" xmlns:wp14="http://schemas.microsoft.com/office/word/2010/wordprocessingDrawing" xmlns:wp="http://schemas.openxmlformats.org/drawingml/2006/wordprocessingDrawing" xmlns:w10="urn:schemas-microsoft-com:office:word" xmlns:w="http://schemas.openxmlformats.org/wordprocessingml/2006/main" xmlns:w14="http://schemas.microsoft.com/office/word/2010/wordml" xmlns:w15="http://schemas.microsoft.com/office/word/2012/wordml" xmlns:w16cid="http://schemas.microsoft.com/office/word/2016/wordml/cid" xmlns:w16se="http://schemas.microsoft.com/office/word/2015/wordml/symex" xmlns:wpg="http://schemas.microsoft.com/office/word/2010/wordprocessingGroup" xmlns:wpi="http://schemas.microsoft.com/office/word/2010/wordprocessingInk" xmlns:wne="http://schemas.microsoft.com/office/word/2006/wordml" xmlns:wps="http://schemas.microsoft.com/office/word/2010/wordprocessingShape" mc:Ignorable="w14 w15 w16se w16cid wp14">
   <w:body>
+    <w:bookmarkStart w:id="0" w:name="_GoBack" w:displacedByCustomXml="next"/>
+    <w:bookmarkEnd w:id="0" w:displacedByCustomXml="next"/>
     <w:sdt>
       <w:sdtPr>
         <w:rPr>
@@ -74,6 +76,7 @@
                   <w:dataBinding w:prefixMappings="xmlns:ns0='http://schemas.openxmlformats.org/package/2006/metadata/core-properties' xmlns:ns1='http://purl.org/dc/elements/1.1/'" w:xpath="/ns0:coreProperties[1]/ns1:title[1]" w:storeItemID="{6C3C8BC8-F283-45AE-878A-BAB7291924A1}"/>
                   <w:text/>
                 </w:sdtPr>
+                <w:sdtEndPr/>
                 <w:sdtContent>
                   <w:p>
                     <w:pPr>
@@ -165,6 +168,7 @@
                 <w:dataBinding w:prefixMappings="xmlns:ns0='http://schemas.openxmlformats.org/package/2006/metadata/core-properties' xmlns:ns1='http://purl.org/dc/elements/1.1/'" w:xpath="/ns0:coreProperties[1]/ns1:subject[1]" w:storeItemID="{6C3C8BC8-F283-45AE-878A-BAB7291924A1}"/>
                 <w:text/>
               </w:sdtPr>
+              <w:sdtEndPr/>
               <w:sdtContent>
                 <w:tc>
                   <w:tcPr>
@@ -232,6 +236,7 @@
                   <w:dataBinding w:prefixMappings="xmlns:ns0='http://schemas.openxmlformats.org/package/2006/metadata/core-properties' xmlns:ns1='http://purl.org/dc/elements/1.1/'" w:xpath="/ns0:coreProperties[1]/ns1:creator[1]" w:storeItemID="{6C3C8BC8-F283-45AE-878A-BAB7291924A1}"/>
                   <w:text/>
                 </w:sdtPr>
+                <w:sdtEndPr/>
                 <w:sdtContent>
                   <w:p>
                     <w:pPr>
@@ -267,6 +272,7 @@
                     <w:calendar w:val="gregorian"/>
                   </w:date>
                 </w:sdtPr>
+                <w:sdtEndPr/>
                 <w:sdtContent>
                   <w:p>
                     <w:pPr>
@@ -319,8 +325,8 @@
         </w:sectPr>
       </w:pPr>
     </w:p>
-    <w:bookmarkStart w:id="0" w:name="The_Programming_Process"/>
-    <w:bookmarkEnd w:id="0"/>
+    <w:bookmarkStart w:id="1" w:name="The_Programming_Process"/>
+    <w:bookmarkEnd w:id="1"/>
     <w:p>
       <w:pPr>
         <w:pStyle w:val="Indholdsfortegnelse1"/>
@@ -2201,12 +2207,12 @@
         <w:pStyle w:val="Overskrift1"/>
         <w:ind w:left="0"/>
       </w:pPr>
-      <w:bookmarkStart w:id="1" w:name="_Toc206947437"/>
+      <w:bookmarkStart w:id="2" w:name="_Toc206947437"/>
       <w:r>
         <w:lastRenderedPageBreak/>
         <w:t>Introduction</w:t>
       </w:r>
-      <w:bookmarkEnd w:id="1"/>
+      <w:bookmarkEnd w:id="2"/>
     </w:p>
     <w:p>
       <w:pPr>
@@ -2351,12 +2357,12 @@
         <w:pStyle w:val="Overskrift1"/>
         <w:ind w:left="0"/>
       </w:pPr>
-      <w:bookmarkStart w:id="2" w:name="_Toc206947438"/>
+      <w:bookmarkStart w:id="3" w:name="_Toc206947438"/>
       <w:r>
         <w:lastRenderedPageBreak/>
         <w:t>The Object concept</w:t>
       </w:r>
-      <w:bookmarkEnd w:id="2"/>
+      <w:bookmarkEnd w:id="3"/>
     </w:p>
     <w:p>
       <w:pPr>
@@ -2543,13 +2549,13 @@
         <w:pStyle w:val="Overskrift2"/>
         <w:ind w:left="0"/>
       </w:pPr>
-      <w:bookmarkStart w:id="3" w:name="_Toc510548833"/>
-      <w:bookmarkStart w:id="4" w:name="_Toc206947439"/>
+      <w:bookmarkStart w:id="4" w:name="_Toc510548833"/>
+      <w:bookmarkStart w:id="5" w:name="_Toc206947439"/>
       <w:r>
         <w:t>State and Behavior</w:t>
       </w:r>
-      <w:bookmarkEnd w:id="3"/>
       <w:bookmarkEnd w:id="4"/>
+      <w:bookmarkEnd w:id="5"/>
     </w:p>
     <w:p>
       <w:pPr>
@@ -3151,7 +3157,7 @@
           </mc:Choice>
           <mc:Fallback>
             <w:pict>
-              <v:rect w14:anchorId="6BD7107E" id="Rektangel 16" o:spid="_x0000_s1026" style="position:absolute;margin-left:166.5pt;margin-top:13.2pt;width:163pt;height:87pt;z-index:251671552;visibility:visible;mso-wrap-style:square;mso-width-percent:0;mso-height-percent:0;mso-wrap-distance-left:9pt;mso-wrap-distance-top:0;mso-wrap-distance-right:9pt;mso-wrap-distance-bottom:0;mso-position-horizontal:absolute;mso-position-horizontal-relative:text;mso-position-vertical:absolute;mso-position-vertical-relative:text;mso-width-percent:0;mso-height-percent:0;mso-width-relative:margin;mso-height-relative:margin;v-text-anchor:middle" o:gfxdata="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" fillcolor="#4f81bd" strokecolor="#385d8a" strokeweight="2pt">
+              <v:rect w14:anchorId="6BD7107E" id="Rektangel 16" o:spid="_x0000_s1026" style="position:absolute;margin-left:166.5pt;margin-top:13.2pt;width:163pt;height:87pt;z-index:251671552;visibility:visible;mso-wrap-style:square;mso-width-percent:0;mso-height-percent:0;mso-wrap-distance-left:9pt;mso-wrap-distance-top:0;mso-wrap-distance-right:9pt;mso-wrap-distance-bottom:0;mso-position-horizontal:absolute;mso-position-horizontal-relative:text;mso-position-vertical:absolute;mso-position-vertical-relative:text;mso-width-percent:0;mso-height-percent:0;mso-width-relative:margin;mso-height-relative:margin;v-text-anchor:middle" o:gfxdata="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" fillcolor="#4f81bd" strokecolor="#385d8a" strokeweight="2pt">
                 <v:textbox>
                   <w:txbxContent>
                     <w:p>
@@ -3540,14 +3546,14 @@
         <w:keepLines/>
         <w:ind w:left="0"/>
       </w:pPr>
-      <w:bookmarkStart w:id="5" w:name="_Toc510548834"/>
-      <w:bookmarkStart w:id="6" w:name="_Toc206947440"/>
+      <w:bookmarkStart w:id="6" w:name="_Toc510548834"/>
+      <w:bookmarkStart w:id="7" w:name="_Toc206947440"/>
       <w:r>
         <w:lastRenderedPageBreak/>
         <w:t>Public and private appearances</w:t>
       </w:r>
-      <w:bookmarkEnd w:id="5"/>
       <w:bookmarkEnd w:id="6"/>
+      <w:bookmarkEnd w:id="7"/>
     </w:p>
     <w:p>
       <w:pPr>
@@ -4578,7 +4584,7 @@
           </mc:Choice>
           <mc:Fallback>
             <w:pict>
-              <v:rect w14:anchorId="0FCDC421" id="Rektangel 19" o:spid="_x0000_s1027" style="position:absolute;margin-left:115.5pt;margin-top:17.2pt;width:142pt;height:92.5pt;z-index:251673600;visibility:visible;mso-wrap-style:square;mso-width-percent:0;mso-height-percent:0;mso-wrap-distance-left:9pt;mso-wrap-distance-top:0;mso-wrap-distance-right:9pt;mso-wrap-distance-bottom:0;mso-position-horizontal:absolute;mso-position-horizontal-relative:text;mso-position-vertical:absolute;mso-position-vertical-relative:text;mso-width-percent:0;mso-height-percent:0;mso-width-relative:margin;mso-height-relative:margin;v-text-anchor:middle" o:gfxdata="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" fillcolor="#4f81bd" strokecolor="#385d8a" strokeweight="2pt">
+              <v:rect w14:anchorId="0FCDC421" id="Rektangel 19" o:spid="_x0000_s1027" style="position:absolute;margin-left:115.5pt;margin-top:17.2pt;width:142pt;height:92.5pt;z-index:251673600;visibility:visible;mso-wrap-style:square;mso-width-percent:0;mso-height-percent:0;mso-wrap-distance-left:9pt;mso-wrap-distance-top:0;mso-wrap-distance-right:9pt;mso-wrap-distance-bottom:0;mso-position-horizontal:absolute;mso-position-horizontal-relative:text;mso-position-vertical:absolute;mso-position-vertical-relative:text;mso-width-percent:0;mso-height-percent:0;mso-width-relative:margin;mso-height-relative:margin;v-text-anchor:middle" o:gfxdata="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" fillcolor="#4f81bd" strokecolor="#385d8a" strokeweight="2pt">
                 <v:textbox>
                   <w:txbxContent>
                     <w:p>
@@ -4886,7 +4892,7 @@
           </mc:Choice>
           <mc:Fallback>
             <w:pict>
-              <v:rect w14:anchorId="1C5FA661" id="Rektangel 17" o:spid="_x0000_s1028" style="position:absolute;margin-left:258pt;margin-top:.6pt;width:142pt;height:92pt;z-index:251672576;visibility:visible;mso-wrap-style:square;mso-width-percent:0;mso-height-percent:0;mso-wrap-distance-left:9pt;mso-wrap-distance-top:0;mso-wrap-distance-right:9pt;mso-wrap-distance-bottom:0;mso-position-horizontal:absolute;mso-position-horizontal-relative:text;mso-position-vertical:absolute;mso-position-vertical-relative:text;mso-width-percent:0;mso-height-percent:0;mso-width-relative:margin;mso-height-relative:margin;v-text-anchor:middle" o:gfxdata="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" fillcolor="#0070c0" strokecolor="#385d8a" strokeweight="2pt">
+              <v:rect w14:anchorId="1C5FA661" id="Rektangel 17" o:spid="_x0000_s1028" style="position:absolute;margin-left:258pt;margin-top:.6pt;width:142pt;height:92pt;z-index:251672576;visibility:visible;mso-wrap-style:square;mso-width-percent:0;mso-height-percent:0;mso-wrap-distance-left:9pt;mso-wrap-distance-top:0;mso-wrap-distance-right:9pt;mso-wrap-distance-bottom:0;mso-position-horizontal:absolute;mso-position-horizontal-relative:text;mso-position-vertical:absolute;mso-position-vertical-relative:text;mso-width-percent:0;mso-height-percent:0;mso-width-relative:margin;mso-height-relative:margin;v-text-anchor:middle" o:gfxdata="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" fillcolor="#0070c0" strokecolor="#385d8a" strokeweight="2pt">
                 <v:textbox>
                   <w:txbxContent>
                     <w:p>
@@ -5077,7 +5083,7 @@
               </wp:anchor>
             </w:drawing>
           </mc:Choice>
-          <mc:Fallback>
+          <mc:Fallback xmlns:oel="http://schemas.microsoft.com/office/2019/extlst" xmlns:w16cex="http://schemas.microsoft.com/office/word/2018/wordml/cex" xmlns:w16="http://schemas.microsoft.com/office/word/2018/wordml" xmlns:w16du="http://schemas.microsoft.com/office/word/2023/wordml/word16du" xmlns:w16sdtdh="http://schemas.microsoft.com/office/word/2020/wordml/sdtdatahash" xmlns:w16sdtfl="http://schemas.microsoft.com/office/word/2024/wordml/sdtformatlock">
             <w:pict>
               <v:shapetype w14:anchorId="0962DBC5" id="_x0000_t96" coordsize="21600,21600" o:spt="96" adj="17520" path="m10800,qx,10800,10800,21600,21600,10800,10800,xem7340,6445qx6215,7570,7340,8695,8465,7570,7340,6445xnfem14260,6445qx13135,7570,14260,8695,15385,7570,14260,6445xnfem4960@0c8853@3,12747@3,16640@0nfe">
                 <v:formulas>
@@ -5165,7 +5171,7 @@
               </wp:anchor>
             </w:drawing>
           </mc:Choice>
-          <mc:Fallback>
+          <mc:Fallback xmlns:oel="http://schemas.microsoft.com/office/2019/extlst" xmlns:w16cex="http://schemas.microsoft.com/office/word/2018/wordml/cex" xmlns:w16="http://schemas.microsoft.com/office/word/2018/wordml" xmlns:w16du="http://schemas.microsoft.com/office/word/2023/wordml/word16du" xmlns:w16sdtdh="http://schemas.microsoft.com/office/word/2020/wordml/sdtdatahash" xmlns:w16sdtfl="http://schemas.microsoft.com/office/word/2024/wordml/sdtformatlock">
             <w:pict>
               <v:shapetype w14:anchorId="3FC6E407" id="_x0000_t69" coordsize="21600,21600" o:spt="69" adj="4320,5400" path="m,10800l@0,21600@0@3@2@3@2,21600,21600,10800@2,0@2@1@0@1@0,xe">
                 <v:stroke joinstyle="miter"/>
@@ -5871,9 +5877,9 @@
           <w:szCs w:val="32"/>
         </w:rPr>
       </w:pPr>
-      <w:bookmarkStart w:id="7" w:name="The_Class_concept"/>
-      <w:bookmarkStart w:id="8" w:name="_Toc510548835"/>
-      <w:bookmarkEnd w:id="7"/>
+      <w:bookmarkStart w:id="8" w:name="The_Class_concept"/>
+      <w:bookmarkStart w:id="9" w:name="_Toc510548835"/>
+      <w:bookmarkEnd w:id="8"/>
       <w:r>
         <w:br w:type="page"/>
       </w:r>
@@ -5883,13 +5889,13 @@
         <w:pStyle w:val="Overskrift1"/>
         <w:ind w:left="0"/>
       </w:pPr>
-      <w:bookmarkStart w:id="9" w:name="_Toc206947441"/>
+      <w:bookmarkStart w:id="10" w:name="_Toc206947441"/>
       <w:r>
         <w:lastRenderedPageBreak/>
         <w:t>The Class concept</w:t>
       </w:r>
-      <w:bookmarkEnd w:id="8"/>
       <w:bookmarkEnd w:id="9"/>
+      <w:bookmarkEnd w:id="10"/>
     </w:p>
     <w:p>
       <w:pPr>
@@ -6529,16 +6535,16 @@
         <w:pStyle w:val="Overskrift2"/>
         <w:ind w:left="0"/>
       </w:pPr>
-      <w:bookmarkStart w:id="10" w:name="Using_objects_of_an_existing_class"/>
-      <w:bookmarkStart w:id="11" w:name="_Toc510548836"/>
-      <w:bookmarkStart w:id="12" w:name="_Toc206947442"/>
-      <w:bookmarkEnd w:id="10"/>
+      <w:bookmarkStart w:id="11" w:name="Using_objects_of_an_existing_class"/>
+      <w:bookmarkStart w:id="12" w:name="_Toc510548836"/>
+      <w:bookmarkStart w:id="13" w:name="_Toc206947442"/>
+      <w:bookmarkEnd w:id="11"/>
       <w:r>
         <w:lastRenderedPageBreak/>
         <w:t>Using objects of an existing class</w:t>
       </w:r>
-      <w:bookmarkEnd w:id="11"/>
       <w:bookmarkEnd w:id="12"/>
+      <w:bookmarkEnd w:id="13"/>
     </w:p>
     <w:p>
       <w:pPr>
@@ -9664,7 +9670,7 @@
         <w:softHyphen/>
         <w:t>meter</w:t>
       </w:r>
-      <w:bookmarkStart w:id="13" w:name="_Toc510548837"/>
+      <w:bookmarkStart w:id="14" w:name="_Toc510548837"/>
       <w:r>
         <w:rPr>
           <w:sz w:val="28"/>
@@ -9694,12 +9700,12 @@
         <w:pStyle w:val="Overskrift2"/>
         <w:ind w:left="0"/>
       </w:pPr>
-      <w:bookmarkStart w:id="14" w:name="_Toc206947443"/>
+      <w:bookmarkStart w:id="15" w:name="_Toc206947443"/>
       <w:r>
         <w:t>Code Quality, part II</w:t>
       </w:r>
-      <w:bookmarkEnd w:id="13"/>
       <w:bookmarkEnd w:id="14"/>
+      <w:bookmarkEnd w:id="15"/>
     </w:p>
     <w:p>
       <w:pPr>
@@ -9904,14 +9910,14 @@
         <w:pStyle w:val="Overskrift2"/>
         <w:ind w:left="0"/>
       </w:pPr>
-      <w:bookmarkStart w:id="15" w:name="_Toc510548838"/>
-      <w:bookmarkStart w:id="16" w:name="_Toc206947444"/>
+      <w:bookmarkStart w:id="16" w:name="_Toc510548838"/>
+      <w:bookmarkStart w:id="17" w:name="_Toc206947444"/>
       <w:r>
         <w:lastRenderedPageBreak/>
         <w:t>Further on object creation</w:t>
       </w:r>
-      <w:bookmarkEnd w:id="15"/>
       <w:bookmarkEnd w:id="16"/>
+      <w:bookmarkEnd w:id="17"/>
     </w:p>
     <w:p>
       <w:pPr>
@@ -10856,19 +10862,19 @@
           <w:szCs w:val="28"/>
         </w:rPr>
       </w:pPr>
-      <w:bookmarkStart w:id="17" w:name="_Toc510548839"/>
+      <w:bookmarkStart w:id="18" w:name="_Toc510548839"/>
     </w:p>
     <w:p>
       <w:pPr>
         <w:pStyle w:val="Overskrift2"/>
         <w:ind w:left="0"/>
       </w:pPr>
-      <w:bookmarkStart w:id="18" w:name="_Toc206947445"/>
+      <w:bookmarkStart w:id="19" w:name="_Toc206947445"/>
       <w:r>
         <w:t>Value types and Reference types</w:t>
       </w:r>
-      <w:bookmarkEnd w:id="17"/>
       <w:bookmarkEnd w:id="18"/>
+      <w:bookmarkEnd w:id="19"/>
     </w:p>
     <w:p>
       <w:pPr>
@@ -12026,7 +12032,7 @@
                 <v:stroke joinstyle="miter"/>
                 <v:path gradientshapeok="t" o:connecttype="rect"/>
               </v:shapetype>
-              <v:shape id="Tekstfelt 2" o:spid="_x0000_s1029" type="#_x0000_t202" style="position:absolute;margin-left:192.3pt;margin-top:4.1pt;width:48.75pt;height:27.65pt;z-index:251662336;visibility:visible;mso-wrap-style:square;mso-width-percent:0;mso-height-percent:0;mso-wrap-distance-left:9pt;mso-wrap-distance-top:0;mso-wrap-distance-right:9pt;mso-wrap-distance-bottom:0;mso-position-horizontal:absolute;mso-position-horizontal-relative:text;mso-position-vertical:absolute;mso-position-vertical-relative:text;mso-width-percent:0;mso-height-percent:0;mso-width-relative:margin;mso-height-relative:margin;v-text-anchor:top" o:gfxdata="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">
+              <v:shape id="Tekstfelt 2" o:spid="_x0000_s1029" type="#_x0000_t202" style="position:absolute;margin-left:192.3pt;margin-top:4.1pt;width:48.75pt;height:27.65pt;z-index:251662336;visibility:visible;mso-wrap-style:square;mso-width-percent:0;mso-height-percent:0;mso-wrap-distance-left:9pt;mso-wrap-distance-top:0;mso-wrap-distance-right:9pt;mso-wrap-distance-bottom:0;mso-position-horizontal:absolute;mso-position-horizontal-relative:text;mso-position-vertical:absolute;mso-position-vertical-relative:text;mso-width-percent:0;mso-height-percent:0;mso-width-relative:margin;mso-height-relative:margin;v-text-anchor:top" o:gfxdata="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">
                 <v:textbox>
                   <w:txbxContent>
                     <w:p>
@@ -12150,7 +12156,7 @@
           </mc:Choice>
           <mc:Fallback>
             <w:pict>
-              <v:rect w14:anchorId="683D7945" id="Rektangel 5" o:spid="_x0000_s1030" style="position:absolute;margin-left:246.3pt;margin-top:1.85pt;width:57pt;height:46.5pt;z-index:251661312;visibility:visible;mso-wrap-style:square;mso-width-percent:0;mso-height-percent:0;mso-wrap-distance-left:9pt;mso-wrap-distance-top:0;mso-wrap-distance-right:9pt;mso-wrap-distance-bottom:0;mso-position-horizontal:absolute;mso-position-horizontal-relative:text;mso-position-vertical:absolute;mso-position-vertical-relative:text;mso-width-percent:0;mso-height-percent:0;mso-width-relative:margin;mso-height-relative:page;v-text-anchor:middle" o:gfxdata="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" fillcolor="#4f81bd" strokecolor="#385d8a" strokeweight="2pt">
+              <v:rect w14:anchorId="683D7945" id="Rektangel 5" o:spid="_x0000_s1030" style="position:absolute;margin-left:246.3pt;margin-top:1.85pt;width:57pt;height:46.5pt;z-index:251661312;visibility:visible;mso-wrap-style:square;mso-width-percent:0;mso-height-percent:0;mso-wrap-distance-left:9pt;mso-wrap-distance-top:0;mso-wrap-distance-right:9pt;mso-wrap-distance-bottom:0;mso-position-horizontal:absolute;mso-position-horizontal-relative:text;mso-position-vertical:absolute;mso-position-vertical-relative:text;mso-width-percent:0;mso-height-percent:0;mso-width-relative:margin;mso-height-relative:page;v-text-anchor:middle" o:gfxdata="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" fillcolor="#4f81bd" strokecolor="#385d8a" strokeweight="2pt">
                 <v:path arrowok="t"/>
                 <v:textbox>
                   <w:txbxContent>
@@ -12264,7 +12270,7 @@
           </mc:Choice>
           <mc:Fallback>
             <w:pict>
-              <v:shape w14:anchorId="6A76ABD9" id="_x0000_s1031" type="#_x0000_t202" style="position:absolute;margin-left:22.05pt;margin-top:3.35pt;width:48.75pt;height:27.65pt;z-index:251660288;visibility:visible;mso-wrap-style:square;mso-width-percent:0;mso-height-percent:0;mso-wrap-distance-left:9pt;mso-wrap-distance-top:0;mso-wrap-distance-right:9pt;mso-wrap-distance-bottom:0;mso-position-horizontal:absolute;mso-position-horizontal-relative:text;mso-position-vertical:absolute;mso-position-vertical-relative:text;mso-width-percent:0;mso-height-percent:0;mso-width-relative:margin;mso-height-relative:margin;v-text-anchor:top" o:gfxdata="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">
+              <v:shape w14:anchorId="6A76ABD9" id="_x0000_s1031" type="#_x0000_t202" style="position:absolute;margin-left:22.05pt;margin-top:3.35pt;width:48.75pt;height:27.65pt;z-index:251660288;visibility:visible;mso-wrap-style:square;mso-width-percent:0;mso-height-percent:0;mso-wrap-distance-left:9pt;mso-wrap-distance-top:0;mso-wrap-distance-right:9pt;mso-wrap-distance-bottom:0;mso-position-horizontal:absolute;mso-position-horizontal-relative:text;mso-position-vertical:absolute;mso-position-vertical-relative:text;mso-width-percent:0;mso-height-percent:0;mso-width-relative:margin;mso-height-relative:margin;v-text-anchor:top" o:gfxdata="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">
                 <v:textbox>
                   <w:txbxContent>
                     <w:p>
@@ -12379,7 +12385,7 @@
           </mc:Choice>
           <mc:Fallback>
             <w:pict>
-              <v:rect w14:anchorId="042865CD" id="Rektangel 1" o:spid="_x0000_s1032" style="position:absolute;margin-left:75.3pt;margin-top:1.85pt;width:57pt;height:46.5pt;z-index:251659264;visibility:visible;mso-wrap-style:square;mso-width-percent:0;mso-height-percent:0;mso-wrap-distance-left:9pt;mso-wrap-distance-top:0;mso-wrap-distance-right:9pt;mso-wrap-distance-bottom:0;mso-position-horizontal:absolute;mso-position-horizontal-relative:text;mso-position-vertical:absolute;mso-position-vertical-relative:text;mso-width-percent:0;mso-height-percent:0;mso-width-relative:margin;mso-height-relative:page;v-text-anchor:middle" o:gfxdata="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" fillcolor="#4f81bd" strokecolor="#385d8a" strokeweight="2pt">
+              <v:rect w14:anchorId="042865CD" id="Rektangel 1" o:spid="_x0000_s1032" style="position:absolute;margin-left:75.3pt;margin-top:1.85pt;width:57pt;height:46.5pt;z-index:251659264;visibility:visible;mso-wrap-style:square;mso-width-percent:0;mso-height-percent:0;mso-wrap-distance-left:9pt;mso-wrap-distance-top:0;mso-wrap-distance-right:9pt;mso-wrap-distance-bottom:0;mso-position-horizontal:absolute;mso-position-horizontal-relative:text;mso-position-vertical:absolute;mso-position-vertical-relative:text;mso-width-percent:0;mso-height-percent:0;mso-width-relative:margin;mso-height-relative:page;v-text-anchor:middle" o:gfxdata="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" fillcolor="#4f81bd" strokecolor="#385d8a" strokeweight="2pt">
                 <v:path arrowok="t"/>
                 <v:textbox>
                   <w:txbxContent>
@@ -12601,7 +12607,7 @@
           </mc:Choice>
           <mc:Fallback>
             <w:pict>
-              <v:shape w14:anchorId="5B4CDD07" id="_x0000_s1033" type="#_x0000_t202" style="position:absolute;margin-left:192.3pt;margin-top:4.1pt;width:48.75pt;height:27.65pt;z-index:251679744;visibility:visible;mso-wrap-style:square;mso-width-percent:0;mso-height-percent:0;mso-wrap-distance-left:9pt;mso-wrap-distance-top:0;mso-wrap-distance-right:9pt;mso-wrap-distance-bottom:0;mso-position-horizontal:absolute;mso-position-horizontal-relative:text;mso-position-vertical:absolute;mso-position-vertical-relative:text;mso-width-percent:0;mso-height-percent:0;mso-width-relative:margin;mso-height-relative:margin;v-text-anchor:top" o:gfxdata="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">
+              <v:shape w14:anchorId="5B4CDD07" id="_x0000_s1033" type="#_x0000_t202" style="position:absolute;margin-left:192.3pt;margin-top:4.1pt;width:48.75pt;height:27.65pt;z-index:251679744;visibility:visible;mso-wrap-style:square;mso-width-percent:0;mso-height-percent:0;mso-wrap-distance-left:9pt;mso-wrap-distance-top:0;mso-wrap-distance-right:9pt;mso-wrap-distance-bottom:0;mso-position-horizontal:absolute;mso-position-horizontal-relative:text;mso-position-vertical:absolute;mso-position-vertical-relative:text;mso-width-percent:0;mso-height-percent:0;mso-width-relative:margin;mso-height-relative:margin;v-text-anchor:top" o:gfxdata="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">
                 <v:textbox>
                   <w:txbxContent>
                     <w:p>
@@ -12725,7 +12731,7 @@
           </mc:Choice>
           <mc:Fallback>
             <w:pict>
-              <v:rect w14:anchorId="53AB934B" id="_x0000_s1034" style="position:absolute;margin-left:246.3pt;margin-top:1.85pt;width:57pt;height:46.5pt;z-index:251678720;visibility:visible;mso-wrap-style:square;mso-width-percent:0;mso-height-percent:0;mso-wrap-distance-left:9pt;mso-wrap-distance-top:0;mso-wrap-distance-right:9pt;mso-wrap-distance-bottom:0;mso-position-horizontal:absolute;mso-position-horizontal-relative:text;mso-position-vertical:absolute;mso-position-vertical-relative:text;mso-width-percent:0;mso-height-percent:0;mso-width-relative:margin;mso-height-relative:page;v-text-anchor:middle" o:gfxdata="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" fillcolor="#4f81bd" strokecolor="#385d8a" strokeweight="2pt">
+              <v:rect w14:anchorId="53AB934B" id="_x0000_s1034" style="position:absolute;margin-left:246.3pt;margin-top:1.85pt;width:57pt;height:46.5pt;z-index:251678720;visibility:visible;mso-wrap-style:square;mso-width-percent:0;mso-height-percent:0;mso-wrap-distance-left:9pt;mso-wrap-distance-top:0;mso-wrap-distance-right:9pt;mso-wrap-distance-bottom:0;mso-position-horizontal:absolute;mso-position-horizontal-relative:text;mso-position-vertical:absolute;mso-position-vertical-relative:text;mso-width-percent:0;mso-height-percent:0;mso-width-relative:margin;mso-height-relative:page;v-text-anchor:middle" o:gfxdata="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" fillcolor="#4f81bd" strokecolor="#385d8a" strokeweight="2pt">
                 <v:path arrowok="t"/>
                 <v:textbox>
                   <w:txbxContent>
@@ -12839,7 +12845,7 @@
           </mc:Choice>
           <mc:Fallback>
             <w:pict>
-              <v:shape w14:anchorId="13E49C39" id="_x0000_s1035" type="#_x0000_t202" style="position:absolute;margin-left:22.05pt;margin-top:3.35pt;width:48.75pt;height:27.65pt;z-index:251677696;visibility:visible;mso-wrap-style:square;mso-width-percent:0;mso-height-percent:0;mso-wrap-distance-left:9pt;mso-wrap-distance-top:0;mso-wrap-distance-right:9pt;mso-wrap-distance-bottom:0;mso-position-horizontal:absolute;mso-position-horizontal-relative:text;mso-position-vertical:absolute;mso-position-vertical-relative:text;mso-width-percent:0;mso-height-percent:0;mso-width-relative:margin;mso-height-relative:margin;v-text-anchor:top" o:gfxdata="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">
+              <v:shape w14:anchorId="13E49C39" id="_x0000_s1035" type="#_x0000_t202" style="position:absolute;margin-left:22.05pt;margin-top:3.35pt;width:48.75pt;height:27.65pt;z-index:251677696;visibility:visible;mso-wrap-style:square;mso-width-percent:0;mso-height-percent:0;mso-wrap-distance-left:9pt;mso-wrap-distance-top:0;mso-wrap-distance-right:9pt;mso-wrap-distance-bottom:0;mso-position-horizontal:absolute;mso-position-horizontal-relative:text;mso-position-vertical:absolute;mso-position-vertical-relative:text;mso-width-percent:0;mso-height-percent:0;mso-width-relative:margin;mso-height-relative:margin;v-text-anchor:top" o:gfxdata="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">
                 <v:textbox>
                   <w:txbxContent>
                     <w:p>
@@ -12956,7 +12962,7 @@
           </mc:Choice>
           <mc:Fallback>
             <w:pict>
-              <v:rect w14:anchorId="63F74FBE" id="_x0000_s1036" style="position:absolute;margin-left:75.3pt;margin-top:1.85pt;width:57pt;height:46.5pt;z-index:251676672;visibility:visible;mso-wrap-style:square;mso-width-percent:0;mso-height-percent:0;mso-wrap-distance-left:9pt;mso-wrap-distance-top:0;mso-wrap-distance-right:9pt;mso-wrap-distance-bottom:0;mso-position-horizontal:absolute;mso-position-horizontal-relative:text;mso-position-vertical:absolute;mso-position-vertical-relative:text;mso-width-percent:0;mso-height-percent:0;mso-width-relative:margin;mso-height-relative:page;v-text-anchor:middle" o:gfxdata="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" fillcolor="#4f81bd" strokecolor="#385d8a" strokeweight="2pt">
+              <v:rect w14:anchorId="63F74FBE" id="_x0000_s1036" style="position:absolute;margin-left:75.3pt;margin-top:1.85pt;width:57pt;height:46.5pt;z-index:251676672;visibility:visible;mso-wrap-style:square;mso-width-percent:0;mso-height-percent:0;mso-wrap-distance-left:9pt;mso-wrap-distance-top:0;mso-wrap-distance-right:9pt;mso-wrap-distance-bottom:0;mso-position-horizontal:absolute;mso-position-horizontal-relative:text;mso-position-vertical:absolute;mso-position-vertical-relative:text;mso-width-percent:0;mso-height-percent:0;mso-width-relative:margin;mso-height-relative:page;v-text-anchor:middle" o:gfxdata="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" fillcolor="#4f81bd" strokecolor="#385d8a" strokeweight="2pt">
                 <v:path arrowok="t"/>
                 <v:textbox>
                   <w:txbxContent>
@@ -13325,7 +13331,7 @@
               </wp:anchor>
             </w:drawing>
           </mc:Choice>
-          <mc:Fallback>
+          <mc:Fallback xmlns:oel="http://schemas.microsoft.com/office/2019/extlst" xmlns:w16cex="http://schemas.microsoft.com/office/word/2018/wordml/cex" xmlns:w16="http://schemas.microsoft.com/office/word/2018/wordml" xmlns:w16du="http://schemas.microsoft.com/office/word/2023/wordml/word16du" xmlns:w16sdtdh="http://schemas.microsoft.com/office/word/2020/wordml/sdtdatahash" xmlns:w16sdtfl="http://schemas.microsoft.com/office/word/2024/wordml/sdtformatlock">
             <w:pict>
               <v:shapetype w14:anchorId="6FA52733" id="_x0000_t32" coordsize="21600,21600" o:spt="32" o:oned="t" path="m,l21600,21600e" filled="f">
                 <v:path arrowok="t" fillok="f" o:connecttype="none"/>
@@ -13424,7 +13430,7 @@
           </mc:Choice>
           <mc:Fallback>
             <w:pict>
-              <v:shape w14:anchorId="470C97AA" id="_x0000_s1037" type="#_x0000_t202" style="position:absolute;margin-left:38.8pt;margin-top:.7pt;width:48.75pt;height:27.65pt;z-index:251663360;visibility:visible;mso-wrap-style:square;mso-width-percent:0;mso-height-percent:0;mso-wrap-distance-left:9pt;mso-wrap-distance-top:0;mso-wrap-distance-right:9pt;mso-wrap-distance-bottom:0;mso-position-horizontal:absolute;mso-position-horizontal-relative:text;mso-position-vertical:absolute;mso-position-vertical-relative:text;mso-width-percent:0;mso-height-percent:0;mso-width-relative:margin;mso-height-relative:margin;v-text-anchor:top" o:gfxdata="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">
+              <v:shape w14:anchorId="470C97AA" id="_x0000_s1037" type="#_x0000_t202" style="position:absolute;margin-left:38.8pt;margin-top:.7pt;width:48.75pt;height:27.65pt;z-index:251663360;visibility:visible;mso-wrap-style:square;mso-width-percent:0;mso-height-percent:0;mso-wrap-distance-left:9pt;mso-wrap-distance-top:0;mso-wrap-distance-right:9pt;mso-wrap-distance-bottom:0;mso-position-horizontal:absolute;mso-position-horizontal-relative:text;mso-position-vertical:absolute;mso-position-vertical-relative:text;mso-width-percent:0;mso-height-percent:0;mso-width-relative:margin;mso-height-relative:margin;v-text-anchor:top" o:gfxdata="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">
                 <v:textbox>
                   <w:txbxContent>
                     <w:p>
@@ -13539,7 +13545,7 @@
           </mc:Choice>
           <mc:Fallback>
             <w:pict>
-              <v:rect w14:anchorId="64DF3F57" id="Rektangel 8" o:spid="_x0000_s1038" style="position:absolute;margin-left:176.55pt;margin-top:-14.55pt;width:159pt;height:46.5pt;z-index:251664384;visibility:visible;mso-wrap-style:square;mso-width-percent:0;mso-height-percent:0;mso-wrap-distance-left:9pt;mso-wrap-distance-top:0;mso-wrap-distance-right:9pt;mso-wrap-distance-bottom:0;mso-position-horizontal:absolute;mso-position-horizontal-relative:text;mso-position-vertical:absolute;mso-position-vertical-relative:text;mso-width-percent:0;mso-height-percent:0;mso-width-relative:margin;mso-height-relative:page;v-text-anchor:middle" o:gfxdata="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" fillcolor="#4f81bd" strokecolor="#385d8a" strokeweight="2pt">
+              <v:rect w14:anchorId="64DF3F57" id="Rektangel 8" o:spid="_x0000_s1038" style="position:absolute;margin-left:176.55pt;margin-top:-14.55pt;width:159pt;height:46.5pt;z-index:251664384;visibility:visible;mso-wrap-style:square;mso-width-percent:0;mso-height-percent:0;mso-wrap-distance-left:9pt;mso-wrap-distance-top:0;mso-wrap-distance-right:9pt;mso-wrap-distance-bottom:0;mso-position-horizontal:absolute;mso-position-horizontal-relative:text;mso-position-vertical:absolute;mso-position-vertical-relative:text;mso-width-percent:0;mso-height-percent:0;mso-width-relative:margin;mso-height-relative:page;v-text-anchor:middle" o:gfxdata="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" fillcolor="#4f81bd" strokecolor="#385d8a" strokeweight="2pt">
                 <v:path arrowok="t"/>
                 <v:textbox>
                   <w:txbxContent>
@@ -14005,7 +14011,7 @@
           </mc:Choice>
           <mc:Fallback>
             <w:pict>
-              <v:shape w14:anchorId="531F3CC6" id="_x0000_s1039" type="#_x0000_t202" style="position:absolute;margin-left:396.55pt;margin-top:17.35pt;width:48.75pt;height:27.65pt;z-index:251669504;visibility:visible;mso-wrap-style:square;mso-width-percent:0;mso-height-percent:0;mso-wrap-distance-left:9pt;mso-wrap-distance-top:0;mso-wrap-distance-right:9pt;mso-wrap-distance-bottom:0;mso-position-horizontal:absolute;mso-position-horizontal-relative:text;mso-position-vertical:absolute;mso-position-vertical-relative:text;mso-width-percent:0;mso-height-percent:0;mso-width-relative:margin;mso-height-relative:margin;v-text-anchor:top" o:gfxdata="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">
+              <v:shape w14:anchorId="531F3CC6" id="_x0000_s1039" type="#_x0000_t202" style="position:absolute;margin-left:396.55pt;margin-top:17.35pt;width:48.75pt;height:27.65pt;z-index:251669504;visibility:visible;mso-wrap-style:square;mso-width-percent:0;mso-height-percent:0;mso-wrap-distance-left:9pt;mso-wrap-distance-top:0;mso-wrap-distance-right:9pt;mso-wrap-distance-bottom:0;mso-position-horizontal:absolute;mso-position-horizontal-relative:text;mso-position-vertical:absolute;mso-position-vertical-relative:text;mso-width-percent:0;mso-height-percent:0;mso-width-relative:margin;mso-height-relative:margin;v-text-anchor:top" o:gfxdata="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">
                 <v:textbox>
                   <w:txbxContent>
                     <w:p>
@@ -14119,7 +14125,7 @@
           </mc:Choice>
           <mc:Fallback>
             <w:pict>
-              <v:shape w14:anchorId="5EFC11F2" id="_x0000_s1040" type="#_x0000_t202" style="position:absolute;margin-left:28.3pt;margin-top:16.8pt;width:48.75pt;height:27.65pt;z-index:251666432;visibility:visible;mso-wrap-style:square;mso-width-percent:0;mso-height-percent:0;mso-wrap-distance-left:9pt;mso-wrap-distance-top:0;mso-wrap-distance-right:9pt;mso-wrap-distance-bottom:0;mso-position-horizontal:absolute;mso-position-horizontal-relative:text;mso-position-vertical:absolute;mso-position-vertical-relative:text;mso-width-percent:0;mso-height-percent:0;mso-width-relative:margin;mso-height-relative:margin;v-text-anchor:top" o:gfxdata="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">
+              <v:shape w14:anchorId="5EFC11F2" id="_x0000_s1040" type="#_x0000_t202" style="position:absolute;margin-left:28.3pt;margin-top:16.8pt;width:48.75pt;height:27.65pt;z-index:251666432;visibility:visible;mso-wrap-style:square;mso-width-percent:0;mso-height-percent:0;mso-wrap-distance-left:9pt;mso-wrap-distance-top:0;mso-wrap-distance-right:9pt;mso-wrap-distance-bottom:0;mso-position-horizontal:absolute;mso-position-horizontal-relative:text;mso-position-vertical:absolute;mso-position-vertical-relative:text;mso-width-percent:0;mso-height-percent:0;mso-width-relative:margin;mso-height-relative:margin;v-text-anchor:top" o:gfxdata="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">
                 <v:textbox>
                   <w:txbxContent>
                     <w:p>
@@ -14236,7 +14242,7 @@
           </mc:Choice>
           <mc:Fallback>
             <w:pict>
-              <v:rect w14:anchorId="23ED86F5" id="Rektangel 12" o:spid="_x0000_s1041" style="position:absolute;margin-left:151.8pt;margin-top:9.6pt;width:159pt;height:46.5pt;z-index:251668480;visibility:visible;mso-wrap-style:square;mso-width-percent:0;mso-height-percent:0;mso-wrap-distance-left:9pt;mso-wrap-distance-top:0;mso-wrap-distance-right:9pt;mso-wrap-distance-bottom:0;mso-position-horizontal:absolute;mso-position-horizontal-relative:text;mso-position-vertical:absolute;mso-position-vertical-relative:text;mso-width-percent:0;mso-height-percent:0;mso-width-relative:margin;mso-height-relative:page;v-text-anchor:middle" o:gfxdata="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" fillcolor="#4f81bd" strokecolor="#385d8a" strokeweight="2pt">
+              <v:rect w14:anchorId="23ED86F5" id="Rektangel 12" o:spid="_x0000_s1041" style="position:absolute;margin-left:151.8pt;margin-top:9.6pt;width:159pt;height:46.5pt;z-index:251668480;visibility:visible;mso-wrap-style:square;mso-width-percent:0;mso-height-percent:0;mso-wrap-distance-left:9pt;mso-wrap-distance-top:0;mso-wrap-distance-right:9pt;mso-wrap-distance-bottom:0;mso-position-horizontal:absolute;mso-position-horizontal-relative:text;mso-position-vertical:absolute;mso-position-vertical-relative:text;mso-width-percent:0;mso-height-percent:0;mso-width-relative:margin;mso-height-relative:page;v-text-anchor:middle" o:gfxdata="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" fillcolor="#4f81bd" strokecolor="#385d8a" strokeweight="2pt">
                 <v:path arrowok="t"/>
                 <v:textbox>
                   <w:txbxContent>
@@ -14337,7 +14343,7 @@
               </wp:anchor>
             </w:drawing>
           </mc:Choice>
-          <mc:Fallback>
+          <mc:Fallback xmlns:oel="http://schemas.microsoft.com/office/2019/extlst" xmlns:w16cex="http://schemas.microsoft.com/office/word/2018/wordml/cex" xmlns:w16="http://schemas.microsoft.com/office/word/2018/wordml" xmlns:w16du="http://schemas.microsoft.com/office/word/2023/wordml/word16du" xmlns:w16sdtdh="http://schemas.microsoft.com/office/word/2020/wordml/sdtdatahash" xmlns:w16sdtfl="http://schemas.microsoft.com/office/word/2024/wordml/sdtformatlock">
             <w:pict>
               <v:shape w14:anchorId="68A9CABE" id="Lige pilforbindelse 14" o:spid="_x0000_s1026" type="#_x0000_t32" style="position:absolute;margin-left:312pt;margin-top:6.7pt;width:83.5pt;height:3.6pt;flip:x;z-index:251670528;visibility:visible;mso-wrap-style:square;mso-width-percent:0;mso-height-percent:0;mso-wrap-distance-left:9pt;mso-wrap-distance-top:-3e-5mm;mso-wrap-distance-right:9pt;mso-wrap-distance-bottom:-3e-5mm;mso-position-horizontal:absolute;mso-position-horizontal-relative:text;mso-position-vertical:absolute;mso-position-vertical-relative:text;mso-width-percent:0;mso-height-percent:0;mso-width-relative:margin;mso-height-relative:margin" o:gfxdata="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" strokecolor="#4a7ebb" strokeweight="3pt">
                 <v:stroke endarrow="open"/>
@@ -14410,7 +14416,7 @@
               </wp:anchor>
             </w:drawing>
           </mc:Choice>
-          <mc:Fallback>
+          <mc:Fallback xmlns:oel="http://schemas.microsoft.com/office/2019/extlst" xmlns:w16cex="http://schemas.microsoft.com/office/word/2018/wordml/cex" xmlns:w16="http://schemas.microsoft.com/office/word/2018/wordml" xmlns:w16du="http://schemas.microsoft.com/office/word/2023/wordml/word16du" xmlns:w16sdtdh="http://schemas.microsoft.com/office/word/2020/wordml/sdtdatahash" xmlns:w16sdtfl="http://schemas.microsoft.com/office/word/2024/wordml/sdtformatlock">
             <w:pict>
               <v:shape w14:anchorId="25405DE2" id="Lige pilforbindelse 11" o:spid="_x0000_s1026" type="#_x0000_t32" style="position:absolute;margin-left:78.5pt;margin-top:9.7pt;width:1in;height:3.6pt;z-index:251667456;visibility:visible;mso-wrap-style:square;mso-width-percent:0;mso-height-percent:0;mso-wrap-distance-left:9pt;mso-wrap-distance-top:-3e-5mm;mso-wrap-distance-right:9pt;mso-wrap-distance-bottom:-3e-5mm;mso-position-horizontal:absolute;mso-position-horizontal-relative:text;mso-position-vertical:absolute;mso-position-vertical-relative:text;mso-width-percent:0;mso-height-percent:0;mso-width-relative:margin;mso-height-relative:page" o:gfxdata="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" strokecolor="#4a7ebb" strokeweight="3pt">
                 <v:stroke endarrow="open"/>
@@ -15749,7 +15755,7 @@
           <w:szCs w:val="32"/>
         </w:rPr>
       </w:pPr>
-      <w:bookmarkStart w:id="19" w:name="_Toc510548840"/>
+      <w:bookmarkStart w:id="20" w:name="_Toc510548840"/>
       <w:r>
         <w:br w:type="page"/>
       </w:r>
@@ -15759,13 +15765,13 @@
         <w:pStyle w:val="Overskrift1"/>
         <w:ind w:left="0"/>
       </w:pPr>
-      <w:bookmarkStart w:id="20" w:name="_Toc206947446"/>
+      <w:bookmarkStart w:id="21" w:name="_Toc206947446"/>
       <w:r>
         <w:lastRenderedPageBreak/>
         <w:t>Class definition elements</w:t>
       </w:r>
-      <w:bookmarkEnd w:id="19"/>
       <w:bookmarkEnd w:id="20"/>
+      <w:bookmarkEnd w:id="21"/>
     </w:p>
     <w:p>
       <w:pPr>
@@ -15952,7 +15958,7 @@
               </wp:anchor>
             </w:drawing>
           </mc:Choice>
-          <mc:Fallback>
+          <mc:Fallback xmlns:oel="http://schemas.microsoft.com/office/2019/extlst" xmlns:w16cex="http://schemas.microsoft.com/office/word/2018/wordml/cex" xmlns:w16="http://schemas.microsoft.com/office/word/2018/wordml" xmlns:w16du="http://schemas.microsoft.com/office/word/2023/wordml/word16du" xmlns:w16sdtdh="http://schemas.microsoft.com/office/word/2020/wordml/sdtdatahash" xmlns:w16sdtfl="http://schemas.microsoft.com/office/word/2024/wordml/sdtformatlock">
             <w:pict>
               <v:oval w14:anchorId="0DF9CFA4" id="Ellipse 417" o:spid="_x0000_s1026" style="position:absolute;margin-left:94.7pt;margin-top:225.55pt;width:64pt;height:24.5pt;z-index:251680768;visibility:visible;mso-wrap-style:square;mso-wrap-distance-left:9pt;mso-wrap-distance-top:0;mso-wrap-distance-right:9pt;mso-wrap-distance-bottom:0;mso-position-horizontal:absolute;mso-position-horizontal-relative:text;mso-position-vertical:absolute;mso-position-vertical-relative:text;v-text-anchor:middle" o:gfxdata="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" filled="f" strokecolor="red" strokeweight="2pt"/>
             </w:pict>
@@ -17108,14 +17114,14 @@
         <w:keepLines/>
         <w:ind w:left="0"/>
       </w:pPr>
-      <w:bookmarkStart w:id="21" w:name="_Toc510548841"/>
-      <w:bookmarkStart w:id="22" w:name="_Toc206947447"/>
+      <w:bookmarkStart w:id="22" w:name="_Toc510548841"/>
+      <w:bookmarkStart w:id="23" w:name="_Toc206947447"/>
       <w:r>
         <w:lastRenderedPageBreak/>
         <w:t>Instance fields</w:t>
       </w:r>
-      <w:bookmarkEnd w:id="21"/>
       <w:bookmarkEnd w:id="22"/>
+      <w:bookmarkEnd w:id="23"/>
     </w:p>
     <w:p>
       <w:pPr>
@@ -17837,14 +17843,14 @@
         <w:pStyle w:val="Overskrift2"/>
         <w:ind w:left="0"/>
       </w:pPr>
-      <w:bookmarkStart w:id="23" w:name="_Toc510548842"/>
-      <w:bookmarkStart w:id="24" w:name="_Toc206947448"/>
+      <w:bookmarkStart w:id="24" w:name="_Toc510548842"/>
+      <w:bookmarkStart w:id="25" w:name="_Toc206947448"/>
       <w:r>
         <w:lastRenderedPageBreak/>
         <w:t>Properties</w:t>
       </w:r>
-      <w:bookmarkEnd w:id="23"/>
       <w:bookmarkEnd w:id="24"/>
+      <w:bookmarkEnd w:id="25"/>
     </w:p>
     <w:p>
       <w:pPr>
@@ -22426,11 +22432,11 @@
         <w:pStyle w:val="Overskrift2"/>
         <w:ind w:left="0"/>
       </w:pPr>
-      <w:bookmarkStart w:id="25" w:name="_Toc206947449"/>
+      <w:bookmarkStart w:id="26" w:name="_Toc206947449"/>
       <w:r>
         <w:t>Auto-properties</w:t>
       </w:r>
-      <w:bookmarkEnd w:id="25"/>
+      <w:bookmarkEnd w:id="26"/>
     </w:p>
     <w:p>
       <w:pPr>
@@ -23050,13 +23056,13 @@
         <w:pStyle w:val="Overskrift2"/>
         <w:ind w:left="0"/>
       </w:pPr>
-      <w:bookmarkStart w:id="26" w:name="_Toc510548843"/>
-      <w:bookmarkStart w:id="27" w:name="_Toc206947450"/>
+      <w:bookmarkStart w:id="27" w:name="_Toc510548843"/>
+      <w:bookmarkStart w:id="28" w:name="_Toc206947450"/>
       <w:r>
         <w:t>Methods</w:t>
       </w:r>
-      <w:bookmarkEnd w:id="26"/>
       <w:bookmarkEnd w:id="27"/>
+      <w:bookmarkEnd w:id="28"/>
     </w:p>
     <w:p>
       <w:pPr>
@@ -25493,13 +25499,13 @@
         <w:pStyle w:val="Overskrift2"/>
         <w:ind w:left="0"/>
       </w:pPr>
-      <w:bookmarkStart w:id="28" w:name="_Toc510548844"/>
-      <w:bookmarkStart w:id="29" w:name="_Toc206947451"/>
+      <w:bookmarkStart w:id="29" w:name="_Toc510548844"/>
+      <w:bookmarkStart w:id="30" w:name="_Toc206947451"/>
       <w:r>
         <w:t>Constructors</w:t>
       </w:r>
-      <w:bookmarkEnd w:id="28"/>
       <w:bookmarkEnd w:id="29"/>
+      <w:bookmarkEnd w:id="30"/>
     </w:p>
     <w:p>
       <w:pPr>
@@ -28820,12 +28826,12 @@
         <w:widowControl/>
         <w:ind w:left="0"/>
       </w:pPr>
-      <w:bookmarkStart w:id="30" w:name="_Toc206947452"/>
+      <w:bookmarkStart w:id="31" w:name="_Toc206947452"/>
       <w:r>
         <w:lastRenderedPageBreak/>
         <w:t>A shorter notation for object creation</w:t>
       </w:r>
-      <w:bookmarkEnd w:id="30"/>
+      <w:bookmarkEnd w:id="31"/>
     </w:p>
     <w:p>
       <w:pPr>
@@ -29395,7 +29401,7 @@
           <w:szCs w:val="32"/>
         </w:rPr>
       </w:pPr>
-      <w:bookmarkStart w:id="31" w:name="_Toc510548845"/>
+      <w:bookmarkStart w:id="32" w:name="_Toc510548845"/>
       <w:r>
         <w:br w:type="page"/>
       </w:r>
@@ -29405,13 +29411,13 @@
         <w:pStyle w:val="Overskrift1"/>
         <w:ind w:left="0"/>
       </w:pPr>
-      <w:bookmarkStart w:id="32" w:name="_Toc206947453"/>
+      <w:bookmarkStart w:id="33" w:name="_Toc206947453"/>
       <w:r>
         <w:lastRenderedPageBreak/>
         <w:t>Class collaboration, and a bit about Abstraction</w:t>
       </w:r>
-      <w:bookmarkEnd w:id="31"/>
       <w:bookmarkEnd w:id="32"/>
+      <w:bookmarkEnd w:id="33"/>
     </w:p>
     <w:p>
       <w:pPr>
@@ -30840,7 +30846,7 @@
         </w:rPr>
         <w:t>You can hopefully see that this way of thinking fits very well to the main features of object-oriented programming; you can specify how an object presents itself to the outside world – i.e. how the outside world should interact with it – and then hide away the details of implementation inside the private sections of the object.</w:t>
       </w:r>
-      <w:bookmarkStart w:id="33" w:name="_Toc510548846"/>
+      <w:bookmarkStart w:id="34" w:name="_Toc510548846"/>
       <w:r>
         <w:br w:type="page"/>
       </w:r>
@@ -30850,13 +30856,13 @@
         <w:pStyle w:val="Overskrift1"/>
         <w:ind w:left="0"/>
       </w:pPr>
-      <w:bookmarkStart w:id="34" w:name="_Toc206947454"/>
+      <w:bookmarkStart w:id="35" w:name="_Toc206947454"/>
       <w:r>
         <w:lastRenderedPageBreak/>
         <w:t>Static – no object needed</w:t>
       </w:r>
-      <w:bookmarkEnd w:id="33"/>
       <w:bookmarkEnd w:id="34"/>
+      <w:bookmarkEnd w:id="35"/>
     </w:p>
     <w:p>
       <w:pPr>
@@ -32358,12 +32364,12 @@
         <w:pStyle w:val="Overskrift1"/>
         <w:ind w:left="0"/>
       </w:pPr>
-      <w:bookmarkStart w:id="35" w:name="_Toc206947455"/>
+      <w:bookmarkStart w:id="36" w:name="_Toc206947455"/>
       <w:r>
         <w:lastRenderedPageBreak/>
         <w:t>Exercises</w:t>
       </w:r>
-      <w:bookmarkEnd w:id="35"/>
+      <w:bookmarkEnd w:id="36"/>
     </w:p>
     <w:p>
       <w:pPr>
@@ -32448,16 +32454,16 @@
                 <w:lang w:eastAsia="da-DK"/>
               </w:rPr>
             </w:pPr>
-            <w:bookmarkStart w:id="36" w:name="_Toc510676364"/>
-            <w:bookmarkStart w:id="37" w:name="_Toc206947456"/>
+            <w:bookmarkStart w:id="37" w:name="_Toc510676364"/>
+            <w:bookmarkStart w:id="38" w:name="_Toc206947456"/>
             <w:r>
               <w:rPr>
                 <w:lang w:eastAsia="da-DK"/>
               </w:rPr>
               <w:t>OOP.1.1</w:t>
             </w:r>
-            <w:bookmarkEnd w:id="36"/>
             <w:bookmarkEnd w:id="37"/>
+            <w:bookmarkEnd w:id="38"/>
           </w:p>
           <w:p>
             <w:pPr>
@@ -33364,16 +33370,16 @@
                 <w:lang w:eastAsia="da-DK"/>
               </w:rPr>
             </w:pPr>
-            <w:bookmarkStart w:id="38" w:name="_Toc510676365"/>
-            <w:bookmarkStart w:id="39" w:name="_Toc206947457"/>
+            <w:bookmarkStart w:id="39" w:name="_Toc510676365"/>
+            <w:bookmarkStart w:id="40" w:name="_Toc206947457"/>
             <w:r>
               <w:rPr>
                 <w:lang w:eastAsia="da-DK"/>
               </w:rPr>
               <w:t>OOP.1.2</w:t>
             </w:r>
-            <w:bookmarkEnd w:id="38"/>
             <w:bookmarkEnd w:id="39"/>
+            <w:bookmarkEnd w:id="40"/>
           </w:p>
           <w:p>
             <w:pPr>
@@ -34215,16 +34221,16 @@
                 <w:lang w:eastAsia="da-DK"/>
               </w:rPr>
             </w:pPr>
-            <w:bookmarkStart w:id="40" w:name="_Toc510676366"/>
-            <w:bookmarkStart w:id="41" w:name="_Toc206947458"/>
+            <w:bookmarkStart w:id="41" w:name="_Toc510676366"/>
+            <w:bookmarkStart w:id="42" w:name="_Toc206947458"/>
             <w:r>
               <w:rPr>
                 <w:lang w:eastAsia="da-DK"/>
               </w:rPr>
               <w:t>OOP.1.3</w:t>
             </w:r>
-            <w:bookmarkEnd w:id="40"/>
             <w:bookmarkEnd w:id="41"/>
+            <w:bookmarkEnd w:id="42"/>
           </w:p>
           <w:p>
             <w:pPr>
@@ -35058,7 +35064,27 @@
                 <w:szCs w:val="24"/>
                 <w:lang w:eastAsia="da-DK"/>
               </w:rPr>
-              <w:t xml:space="preserve"> somewhere)</w:t>
+              <w:t xml:space="preserve"> </w:t>
+            </w:r>
+            <w:r>
+              <w:rPr>
+                <w:rFonts w:ascii="Calibri" w:eastAsia="Times New Roman" w:hAnsi="Calibri" w:cs="Times New Roman"/>
+                <w:color w:val="00000A"/>
+                <w:sz w:val="24"/>
+                <w:szCs w:val="24"/>
+                <w:lang w:eastAsia="da-DK"/>
+              </w:rPr>
+              <w:t>internally in the object</w:t>
+            </w:r>
+            <w:r>
+              <w:rPr>
+                <w:rFonts w:ascii="Calibri" w:eastAsia="Times New Roman" w:hAnsi="Calibri" w:cs="Times New Roman"/>
+                <w:color w:val="00000A"/>
+                <w:sz w:val="24"/>
+                <w:szCs w:val="24"/>
+                <w:lang w:eastAsia="da-DK"/>
+              </w:rPr>
+              <w:t>)</w:t>
             </w:r>
           </w:p>
           <w:p>
@@ -35526,16 +35552,16 @@
                 <w:lang w:eastAsia="da-DK"/>
               </w:rPr>
             </w:pPr>
-            <w:bookmarkStart w:id="42" w:name="_Toc510676367"/>
-            <w:bookmarkStart w:id="43" w:name="_Toc206947459"/>
+            <w:bookmarkStart w:id="43" w:name="_Toc510676367"/>
+            <w:bookmarkStart w:id="44" w:name="_Toc206947459"/>
             <w:r>
               <w:rPr>
                 <w:lang w:eastAsia="da-DK"/>
               </w:rPr>
               <w:t>OOP.1.4</w:t>
             </w:r>
-            <w:bookmarkEnd w:id="42"/>
             <w:bookmarkEnd w:id="43"/>
+            <w:bookmarkEnd w:id="44"/>
           </w:p>
           <w:p>
             <w:pPr>
@@ -36765,16 +36791,16 @@
                 <w:lang w:eastAsia="da-DK"/>
               </w:rPr>
             </w:pPr>
-            <w:bookmarkStart w:id="44" w:name="_Toc510676368"/>
-            <w:bookmarkStart w:id="45" w:name="_Toc206947460"/>
+            <w:bookmarkStart w:id="45" w:name="_Toc510676368"/>
+            <w:bookmarkStart w:id="46" w:name="_Toc206947460"/>
             <w:r>
               <w:rPr>
                 <w:lang w:eastAsia="da-DK"/>
               </w:rPr>
               <w:t>OOP.1.5</w:t>
             </w:r>
-            <w:bookmarkEnd w:id="44"/>
             <w:bookmarkEnd w:id="45"/>
+            <w:bookmarkEnd w:id="46"/>
           </w:p>
           <w:p>
             <w:pPr>
@@ -37567,16 +37593,16 @@
                 <w:lang w:eastAsia="da-DK"/>
               </w:rPr>
             </w:pPr>
-            <w:bookmarkStart w:id="46" w:name="_Toc510676369"/>
-            <w:bookmarkStart w:id="47" w:name="_Toc206947461"/>
+            <w:bookmarkStart w:id="47" w:name="_Toc510676369"/>
+            <w:bookmarkStart w:id="48" w:name="_Toc206947461"/>
             <w:r>
               <w:rPr>
                 <w:lang w:eastAsia="da-DK"/>
               </w:rPr>
               <w:t>OOP.1.6</w:t>
             </w:r>
-            <w:bookmarkEnd w:id="46"/>
             <w:bookmarkEnd w:id="47"/>
+            <w:bookmarkEnd w:id="48"/>
           </w:p>
           <w:p>
             <w:pPr>
@@ -38819,22 +38845,22 @@
                 <w:lang w:eastAsia="da-DK"/>
               </w:rPr>
             </w:pPr>
-            <w:bookmarkStart w:id="48" w:name="_Toc510676370"/>
-            <w:bookmarkStart w:id="49" w:name="_Toc206947462"/>
+            <w:bookmarkStart w:id="49" w:name="_Toc510676370"/>
+            <w:bookmarkStart w:id="50" w:name="_Toc206947462"/>
             <w:r>
               <w:rPr>
                 <w:lang w:eastAsia="da-DK"/>
               </w:rPr>
               <w:t>OOP.1.</w:t>
             </w:r>
-            <w:bookmarkEnd w:id="48"/>
+            <w:bookmarkEnd w:id="49"/>
             <w:r>
               <w:rPr>
                 <w:lang w:eastAsia="da-DK"/>
               </w:rPr>
               <w:t>7</w:t>
             </w:r>
-            <w:bookmarkEnd w:id="49"/>
+            <w:bookmarkEnd w:id="50"/>
           </w:p>
           <w:p>
             <w:pPr>
@@ -40263,22 +40289,22 @@
                 <w:lang w:eastAsia="da-DK"/>
               </w:rPr>
             </w:pPr>
-            <w:bookmarkStart w:id="50" w:name="_Toc510676371"/>
-            <w:bookmarkStart w:id="51" w:name="_Toc206947463"/>
+            <w:bookmarkStart w:id="51" w:name="_Toc510676371"/>
+            <w:bookmarkStart w:id="52" w:name="_Toc206947463"/>
             <w:r>
               <w:rPr>
                 <w:lang w:eastAsia="da-DK"/>
               </w:rPr>
               <w:t>OOP.1.</w:t>
             </w:r>
-            <w:bookmarkEnd w:id="50"/>
+            <w:bookmarkEnd w:id="51"/>
             <w:r>
               <w:rPr>
                 <w:lang w:eastAsia="da-DK"/>
               </w:rPr>
               <w:t>8</w:t>
             </w:r>
-            <w:bookmarkEnd w:id="51"/>
+            <w:bookmarkEnd w:id="52"/>
           </w:p>
           <w:p>
             <w:pPr>
@@ -41536,22 +41562,22 @@
                 <w:lang w:eastAsia="da-DK"/>
               </w:rPr>
             </w:pPr>
-            <w:bookmarkStart w:id="52" w:name="_Toc510676372"/>
-            <w:bookmarkStart w:id="53" w:name="_Toc206947464"/>
+            <w:bookmarkStart w:id="53" w:name="_Toc510676372"/>
+            <w:bookmarkStart w:id="54" w:name="_Toc206947464"/>
             <w:r>
               <w:rPr>
                 <w:lang w:eastAsia="da-DK"/>
               </w:rPr>
               <w:t>OOP.1.</w:t>
             </w:r>
-            <w:bookmarkEnd w:id="52"/>
+            <w:bookmarkEnd w:id="53"/>
             <w:r>
               <w:rPr>
                 <w:lang w:eastAsia="da-DK"/>
               </w:rPr>
               <w:t>9</w:t>
             </w:r>
-            <w:bookmarkEnd w:id="53"/>
+            <w:bookmarkEnd w:id="54"/>
           </w:p>
           <w:p>
             <w:pPr>
@@ -42487,7 +42513,7 @@
 </file>
 
 <file path=word/endnotes.xml><?xml version="1.0" encoding="utf-8"?>
-<w:endnotes xmlns:wpc="http://schemas.microsoft.com/office/word/2010/wordprocessingCanvas" xmlns:cx="http://schemas.microsoft.com/office/drawing/2014/chartex" xmlns:cx1="http://schemas.microsoft.com/office/drawing/2015/9/8/chartex" xmlns:cx2="http://schemas.microsoft.com/office/drawing/2015/10/21/chartex" xmlns:cx3="http://schemas.microsoft.com/office/drawing/2016/5/9/chartex" xmlns:cx4="http://schemas.microsoft.com/office/drawing/2016/5/10/chartex" xmlns:cx5="http://schemas.microsoft.com/office/drawing/2016/5/11/chartex" xmlns:cx6="http://schemas.microsoft.com/office/drawing/2016/5/12/chartex" xmlns:cx7="http://schemas.microsoft.com/office/drawing/2016/5/13/chartex" xmlns:cx8="http://schemas.microsoft.com/office/drawing/2016/5/14/chartex" xmlns:mc="http://schemas.openxmlformats.org/markup-compatibility/2006" xmlns:aink="http://schemas.microsoft.com/office/drawing/2016/ink" xmlns:am3d="http://schemas.microsoft.com/office/drawing/2017/model3d" xmlns:o="urn:schemas-microsoft-com:office:office" xmlns:oel="http://schemas.microsoft.com/office/2019/extlst" xmlns:r="http://schemas.openxmlformats.org/officeDocument/2006/relationships" xmlns:m="http://schemas.openxmlformats.org/officeDocument/2006/math" xmlns:v="urn:schemas-microsoft-com:vml" xmlns:wp14="http://schemas.microsoft.com/office/word/2010/wordprocessingDrawing" xmlns:wp="http://schemas.openxmlformats.org/drawingml/2006/wordprocessingDrawing" xmlns:w10="urn:schemas-microsoft-com:office:word" xmlns:w="http://schemas.openxmlformats.org/wordprocessingml/2006/main" xmlns:w14="http://schemas.microsoft.com/office/word/2010/wordml" xmlns:w15="http://schemas.microsoft.com/office/word/2012/wordml" xmlns:w16cex="http://schemas.microsoft.com/office/word/2018/wordml/cex" xmlns:w16cid="http://schemas.microsoft.com/office/word/2016/wordml/cid" xmlns:w16="http://schemas.microsoft.com/office/word/2018/wordml" xmlns:w16du="http://schemas.microsoft.com/office/word/2023/wordml/word16du" xmlns:w16sdtdh="http://schemas.microsoft.com/office/word/2020/wordml/sdtdatahash" xmlns:w16sdtfl="http://schemas.microsoft.com/office/word/2024/wordml/sdtformatlock" xmlns:w16se="http://schemas.microsoft.com/office/word/2015/wordml/symex" xmlns:wpg="http://schemas.microsoft.com/office/word/2010/wordprocessingGroup" xmlns:wpi="http://schemas.microsoft.com/office/word/2010/wordprocessingInk" xmlns:wne="http://schemas.microsoft.com/office/word/2006/wordml" xmlns:wps="http://schemas.microsoft.com/office/word/2010/wordprocessingShape" mc:Ignorable="w14 w15 w16se w16cid w16 w16cex w16sdtdh w16sdtfl w16du wp14">
+<w:endnotes xmlns:wpc="http://schemas.microsoft.com/office/word/2010/wordprocessingCanvas" xmlns:cx="http://schemas.microsoft.com/office/drawing/2014/chartex" xmlns:cx1="http://schemas.microsoft.com/office/drawing/2015/9/8/chartex" xmlns:cx2="http://schemas.microsoft.com/office/drawing/2015/10/21/chartex" xmlns:cx3="http://schemas.microsoft.com/office/drawing/2016/5/9/chartex" xmlns:cx4="http://schemas.microsoft.com/office/drawing/2016/5/10/chartex" xmlns:cx5="http://schemas.microsoft.com/office/drawing/2016/5/11/chartex" xmlns:cx6="http://schemas.microsoft.com/office/drawing/2016/5/12/chartex" xmlns:cx7="http://schemas.microsoft.com/office/drawing/2016/5/13/chartex" xmlns:cx8="http://schemas.microsoft.com/office/drawing/2016/5/14/chartex" xmlns:mc="http://schemas.openxmlformats.org/markup-compatibility/2006" xmlns:aink="http://schemas.microsoft.com/office/drawing/2016/ink" xmlns:am3d="http://schemas.microsoft.com/office/drawing/2017/model3d" xmlns:o="urn:schemas-microsoft-com:office:office" xmlns:r="http://schemas.openxmlformats.org/officeDocument/2006/relationships" xmlns:m="http://schemas.openxmlformats.org/officeDocument/2006/math" xmlns:v="urn:schemas-microsoft-com:vml" xmlns:wp14="http://schemas.microsoft.com/office/word/2010/wordprocessingDrawing" xmlns:wp="http://schemas.openxmlformats.org/drawingml/2006/wordprocessingDrawing" xmlns:w10="urn:schemas-microsoft-com:office:word" xmlns:w="http://schemas.openxmlformats.org/wordprocessingml/2006/main" xmlns:w14="http://schemas.microsoft.com/office/word/2010/wordml" xmlns:w15="http://schemas.microsoft.com/office/word/2012/wordml" xmlns:w16cid="http://schemas.microsoft.com/office/word/2016/wordml/cid" xmlns:w16se="http://schemas.microsoft.com/office/word/2015/wordml/symex" xmlns:wpg="http://schemas.microsoft.com/office/word/2010/wordprocessingGroup" xmlns:wpi="http://schemas.microsoft.com/office/word/2010/wordprocessingInk" xmlns:wne="http://schemas.microsoft.com/office/word/2006/wordml" xmlns:wps="http://schemas.microsoft.com/office/word/2010/wordprocessingShape" mc:Ignorable="w14 w15 w16se w16cid wp14">
   <w:endnote w:type="separator" w:id="-1">
     <w:p>
       <w:r>
@@ -42506,7 +42532,7 @@
 </file>
 
 <file path=word/footer1.xml><?xml version="1.0" encoding="utf-8"?>
-<w:ftr xmlns:wpc="http://schemas.microsoft.com/office/word/2010/wordprocessingCanvas" xmlns:cx="http://schemas.microsoft.com/office/drawing/2014/chartex" xmlns:cx1="http://schemas.microsoft.com/office/drawing/2015/9/8/chartex" xmlns:cx2="http://schemas.microsoft.com/office/drawing/2015/10/21/chartex" xmlns:cx3="http://schemas.microsoft.com/office/drawing/2016/5/9/chartex" xmlns:cx4="http://schemas.microsoft.com/office/drawing/2016/5/10/chartex" xmlns:cx5="http://schemas.microsoft.com/office/drawing/2016/5/11/chartex" xmlns:cx6="http://schemas.microsoft.com/office/drawing/2016/5/12/chartex" xmlns:cx7="http://schemas.microsoft.com/office/drawing/2016/5/13/chartex" xmlns:cx8="http://schemas.microsoft.com/office/drawing/2016/5/14/chartex" xmlns:mc="http://schemas.openxmlformats.org/markup-compatibility/2006" xmlns:aink="http://schemas.microsoft.com/office/drawing/2016/ink" xmlns:am3d="http://schemas.microsoft.com/office/drawing/2017/model3d" xmlns:o="urn:schemas-microsoft-com:office:office" xmlns:oel="http://schemas.microsoft.com/office/2019/extlst" xmlns:r="http://schemas.openxmlformats.org/officeDocument/2006/relationships" xmlns:m="http://schemas.openxmlformats.org/officeDocument/2006/math" xmlns:v="urn:schemas-microsoft-com:vml" xmlns:wp14="http://schemas.microsoft.com/office/word/2010/wordprocessingDrawing" xmlns:wp="http://schemas.openxmlformats.org/drawingml/2006/wordprocessingDrawing" xmlns:w10="urn:schemas-microsoft-com:office:word" xmlns:w="http://schemas.openxmlformats.org/wordprocessingml/2006/main" xmlns:w14="http://schemas.microsoft.com/office/word/2010/wordml" xmlns:w15="http://schemas.microsoft.com/office/word/2012/wordml" xmlns:w16cex="http://schemas.microsoft.com/office/word/2018/wordml/cex" xmlns:w16cid="http://schemas.microsoft.com/office/word/2016/wordml/cid" xmlns:w16="http://schemas.microsoft.com/office/word/2018/wordml" xmlns:w16du="http://schemas.microsoft.com/office/word/2023/wordml/word16du" xmlns:w16sdtdh="http://schemas.microsoft.com/office/word/2020/wordml/sdtdatahash" xmlns:w16sdtfl="http://schemas.microsoft.com/office/word/2024/wordml/sdtformatlock" xmlns:w16se="http://schemas.microsoft.com/office/word/2015/wordml/symex" xmlns:wpg="http://schemas.microsoft.com/office/word/2010/wordprocessingGroup" xmlns:wpi="http://schemas.microsoft.com/office/word/2010/wordprocessingInk" xmlns:wne="http://schemas.microsoft.com/office/word/2006/wordml" xmlns:wps="http://schemas.microsoft.com/office/word/2010/wordprocessingShape" mc:Ignorable="w14 w15 w16se w16cid w16 w16cex w16sdtdh w16sdtfl w16du wp14">
+<w:ftr xmlns:wpc="http://schemas.microsoft.com/office/word/2010/wordprocessingCanvas" xmlns:cx="http://schemas.microsoft.com/office/drawing/2014/chartex" xmlns:cx1="http://schemas.microsoft.com/office/drawing/2015/9/8/chartex" xmlns:cx2="http://schemas.microsoft.com/office/drawing/2015/10/21/chartex" xmlns:cx3="http://schemas.microsoft.com/office/drawing/2016/5/9/chartex" xmlns:cx4="http://schemas.microsoft.com/office/drawing/2016/5/10/chartex" xmlns:cx5="http://schemas.microsoft.com/office/drawing/2016/5/11/chartex" xmlns:cx6="http://schemas.microsoft.com/office/drawing/2016/5/12/chartex" xmlns:cx7="http://schemas.microsoft.com/office/drawing/2016/5/13/chartex" xmlns:cx8="http://schemas.microsoft.com/office/drawing/2016/5/14/chartex" xmlns:mc="http://schemas.openxmlformats.org/markup-compatibility/2006" xmlns:aink="http://schemas.microsoft.com/office/drawing/2016/ink" xmlns:am3d="http://schemas.microsoft.com/office/drawing/2017/model3d" xmlns:o="urn:schemas-microsoft-com:office:office" xmlns:r="http://schemas.openxmlformats.org/officeDocument/2006/relationships" xmlns:m="http://schemas.openxmlformats.org/officeDocument/2006/math" xmlns:v="urn:schemas-microsoft-com:vml" xmlns:wp14="http://schemas.microsoft.com/office/word/2010/wordprocessingDrawing" xmlns:wp="http://schemas.openxmlformats.org/drawingml/2006/wordprocessingDrawing" xmlns:w10="urn:schemas-microsoft-com:office:word" xmlns:w="http://schemas.openxmlformats.org/wordprocessingml/2006/main" xmlns:w14="http://schemas.microsoft.com/office/word/2010/wordml" xmlns:w15="http://schemas.microsoft.com/office/word/2012/wordml" xmlns:w16cid="http://schemas.microsoft.com/office/word/2016/wordml/cid" xmlns:w16se="http://schemas.microsoft.com/office/word/2015/wordml/symex" xmlns:wpg="http://schemas.microsoft.com/office/word/2010/wordprocessingGroup" xmlns:wpi="http://schemas.microsoft.com/office/word/2010/wordprocessingInk" xmlns:wne="http://schemas.microsoft.com/office/word/2006/wordml" xmlns:wps="http://schemas.microsoft.com/office/word/2010/wordprocessingShape" mc:Ignorable="w14 w15 w16se w16cid wp14">
   <w:sdt>
     <w:sdtPr>
       <w:id w:val="-645208757"/>
@@ -42515,6 +42541,7 @@
         <w:docPartUnique/>
       </w:docPartObj>
     </w:sdtPr>
+    <w:sdtEndPr/>
     <w:sdtContent>
       <w:p>
         <w:pPr>
@@ -42552,7 +42579,7 @@
 </file>
 
 <file path=word/footnotes.xml><?xml version="1.0" encoding="utf-8"?>
-<w:footnotes xmlns:wpc="http://schemas.microsoft.com/office/word/2010/wordprocessingCanvas" xmlns:cx="http://schemas.microsoft.com/office/drawing/2014/chartex" xmlns:cx1="http://schemas.microsoft.com/office/drawing/2015/9/8/chartex" xmlns:cx2="http://schemas.microsoft.com/office/drawing/2015/10/21/chartex" xmlns:cx3="http://schemas.microsoft.com/office/drawing/2016/5/9/chartex" xmlns:cx4="http://schemas.microsoft.com/office/drawing/2016/5/10/chartex" xmlns:cx5="http://schemas.microsoft.com/office/drawing/2016/5/11/chartex" xmlns:cx6="http://schemas.microsoft.com/office/drawing/2016/5/12/chartex" xmlns:cx7="http://schemas.microsoft.com/office/drawing/2016/5/13/chartex" xmlns:cx8="http://schemas.microsoft.com/office/drawing/2016/5/14/chartex" xmlns:mc="http://schemas.openxmlformats.org/markup-compatibility/2006" xmlns:aink="http://schemas.microsoft.com/office/drawing/2016/ink" xmlns:am3d="http://schemas.microsoft.com/office/drawing/2017/model3d" xmlns:o="urn:schemas-microsoft-com:office:office" xmlns:oel="http://schemas.microsoft.com/office/2019/extlst" xmlns:r="http://schemas.openxmlformats.org/officeDocument/2006/relationships" xmlns:m="http://schemas.openxmlformats.org/officeDocument/2006/math" xmlns:v="urn:schemas-microsoft-com:vml" xmlns:wp14="http://schemas.microsoft.com/office/word/2010/wordprocessingDrawing" xmlns:wp="http://schemas.openxmlformats.org/drawingml/2006/wordprocessingDrawing" xmlns:w10="urn:schemas-microsoft-com:office:word" xmlns:w="http://schemas.openxmlformats.org/wordprocessingml/2006/main" xmlns:w14="http://schemas.microsoft.com/office/word/2010/wordml" xmlns:w15="http://schemas.microsoft.com/office/word/2012/wordml" xmlns:w16cex="http://schemas.microsoft.com/office/word/2018/wordml/cex" xmlns:w16cid="http://schemas.microsoft.com/office/word/2016/wordml/cid" xmlns:w16="http://schemas.microsoft.com/office/word/2018/wordml" xmlns:w16du="http://schemas.microsoft.com/office/word/2023/wordml/word16du" xmlns:w16sdtdh="http://schemas.microsoft.com/office/word/2020/wordml/sdtdatahash" xmlns:w16sdtfl="http://schemas.microsoft.com/office/word/2024/wordml/sdtformatlock" xmlns:w16se="http://schemas.microsoft.com/office/word/2015/wordml/symex" xmlns:wpg="http://schemas.microsoft.com/office/word/2010/wordprocessingGroup" xmlns:wpi="http://schemas.microsoft.com/office/word/2010/wordprocessingInk" xmlns:wne="http://schemas.microsoft.com/office/word/2006/wordml" xmlns:wps="http://schemas.microsoft.com/office/word/2010/wordprocessingShape" mc:Ignorable="w14 w15 w16se w16cid w16 w16cex w16sdtdh w16sdtfl w16du wp14">
+<w:footnotes xmlns:wpc="http://schemas.microsoft.com/office/word/2010/wordprocessingCanvas" xmlns:cx="http://schemas.microsoft.com/office/drawing/2014/chartex" xmlns:cx1="http://schemas.microsoft.com/office/drawing/2015/9/8/chartex" xmlns:cx2="http://schemas.microsoft.com/office/drawing/2015/10/21/chartex" xmlns:cx3="http://schemas.microsoft.com/office/drawing/2016/5/9/chartex" xmlns:cx4="http://schemas.microsoft.com/office/drawing/2016/5/10/chartex" xmlns:cx5="http://schemas.microsoft.com/office/drawing/2016/5/11/chartex" xmlns:cx6="http://schemas.microsoft.com/office/drawing/2016/5/12/chartex" xmlns:cx7="http://schemas.microsoft.com/office/drawing/2016/5/13/chartex" xmlns:cx8="http://schemas.microsoft.com/office/drawing/2016/5/14/chartex" xmlns:mc="http://schemas.openxmlformats.org/markup-compatibility/2006" xmlns:aink="http://schemas.microsoft.com/office/drawing/2016/ink" xmlns:am3d="http://schemas.microsoft.com/office/drawing/2017/model3d" xmlns:o="urn:schemas-microsoft-com:office:office" xmlns:r="http://schemas.openxmlformats.org/officeDocument/2006/relationships" xmlns:m="http://schemas.openxmlformats.org/officeDocument/2006/math" xmlns:v="urn:schemas-microsoft-com:vml" xmlns:wp14="http://schemas.microsoft.com/office/word/2010/wordprocessingDrawing" xmlns:wp="http://schemas.openxmlformats.org/drawingml/2006/wordprocessingDrawing" xmlns:w10="urn:schemas-microsoft-com:office:word" xmlns:w="http://schemas.openxmlformats.org/wordprocessingml/2006/main" xmlns:w14="http://schemas.microsoft.com/office/word/2010/wordml" xmlns:w15="http://schemas.microsoft.com/office/word/2012/wordml" xmlns:w16cid="http://schemas.microsoft.com/office/word/2016/wordml/cid" xmlns:w16se="http://schemas.microsoft.com/office/word/2015/wordml/symex" xmlns:wpg="http://schemas.microsoft.com/office/word/2010/wordprocessingGroup" xmlns:wpi="http://schemas.microsoft.com/office/word/2010/wordprocessingInk" xmlns:wne="http://schemas.microsoft.com/office/word/2006/wordml" xmlns:wps="http://schemas.microsoft.com/office/word/2010/wordprocessingShape" mc:Ignorable="w14 w15 w16se w16cid wp14">
   <w:footnote w:type="separator" w:id="-1">
     <w:p>
       <w:r>
@@ -42669,7 +42696,7 @@
 </file>
 
 <file path=word/numbering.xml><?xml version="1.0" encoding="utf-8"?>
-<w:numbering xmlns:wpc="http://schemas.microsoft.com/office/word/2010/wordprocessingCanvas" xmlns:cx="http://schemas.microsoft.com/office/drawing/2014/chartex" xmlns:cx1="http://schemas.microsoft.com/office/drawing/2015/9/8/chartex" xmlns:cx2="http://schemas.microsoft.com/office/drawing/2015/10/21/chartex" xmlns:cx3="http://schemas.microsoft.com/office/drawing/2016/5/9/chartex" xmlns:cx4="http://schemas.microsoft.com/office/drawing/2016/5/10/chartex" xmlns:cx5="http://schemas.microsoft.com/office/drawing/2016/5/11/chartex" xmlns:cx6="http://schemas.microsoft.com/office/drawing/2016/5/12/chartex" xmlns:cx7="http://schemas.microsoft.com/office/drawing/2016/5/13/chartex" xmlns:cx8="http://schemas.microsoft.com/office/drawing/2016/5/14/chartex" xmlns:mc="http://schemas.openxmlformats.org/markup-compatibility/2006" xmlns:aink="http://schemas.microsoft.com/office/drawing/2016/ink" xmlns:am3d="http://schemas.microsoft.com/office/drawing/2017/model3d" xmlns:o="urn:schemas-microsoft-com:office:office" xmlns:oel="http://schemas.microsoft.com/office/2019/extlst" xmlns:r="http://schemas.openxmlformats.org/officeDocument/2006/relationships" xmlns:m="http://schemas.openxmlformats.org/officeDocument/2006/math" xmlns:v="urn:schemas-microsoft-com:vml" xmlns:wp14="http://schemas.microsoft.com/office/word/2010/wordprocessingDrawing" xmlns:wp="http://schemas.openxmlformats.org/drawingml/2006/wordprocessingDrawing" xmlns:w10="urn:schemas-microsoft-com:office:word" xmlns:w="http://schemas.openxmlformats.org/wordprocessingml/2006/main" xmlns:w14="http://schemas.microsoft.com/office/word/2010/wordml" xmlns:w15="http://schemas.microsoft.com/office/word/2012/wordml" xmlns:w16cex="http://schemas.microsoft.com/office/word/2018/wordml/cex" xmlns:w16cid="http://schemas.microsoft.com/office/word/2016/wordml/cid" xmlns:w16="http://schemas.microsoft.com/office/word/2018/wordml" xmlns:w16du="http://schemas.microsoft.com/office/word/2023/wordml/word16du" xmlns:w16sdtdh="http://schemas.microsoft.com/office/word/2020/wordml/sdtdatahash" xmlns:w16sdtfl="http://schemas.microsoft.com/office/word/2024/wordml/sdtformatlock" xmlns:w16se="http://schemas.microsoft.com/office/word/2015/wordml/symex" xmlns:wpg="http://schemas.microsoft.com/office/word/2010/wordprocessingGroup" xmlns:wpi="http://schemas.microsoft.com/office/word/2010/wordprocessingInk" xmlns:wne="http://schemas.microsoft.com/office/word/2006/wordml" xmlns:wps="http://schemas.microsoft.com/office/word/2010/wordprocessingShape" mc:Ignorable="w14 w15 w16se w16cid w16 w16cex w16sdtdh w16sdtfl w16du wp14">
+<w:numbering xmlns:wpc="http://schemas.microsoft.com/office/word/2010/wordprocessingCanvas" xmlns:cx="http://schemas.microsoft.com/office/drawing/2014/chartex" xmlns:cx1="http://schemas.microsoft.com/office/drawing/2015/9/8/chartex" xmlns:cx2="http://schemas.microsoft.com/office/drawing/2015/10/21/chartex" xmlns:cx3="http://schemas.microsoft.com/office/drawing/2016/5/9/chartex" xmlns:cx4="http://schemas.microsoft.com/office/drawing/2016/5/10/chartex" xmlns:cx5="http://schemas.microsoft.com/office/drawing/2016/5/11/chartex" xmlns:cx6="http://schemas.microsoft.com/office/drawing/2016/5/12/chartex" xmlns:cx7="http://schemas.microsoft.com/office/drawing/2016/5/13/chartex" xmlns:cx8="http://schemas.microsoft.com/office/drawing/2016/5/14/chartex" xmlns:mc="http://schemas.openxmlformats.org/markup-compatibility/2006" xmlns:aink="http://schemas.microsoft.com/office/drawing/2016/ink" xmlns:am3d="http://schemas.microsoft.com/office/drawing/2017/model3d" xmlns:o="urn:schemas-microsoft-com:office:office" xmlns:r="http://schemas.openxmlformats.org/officeDocument/2006/relationships" xmlns:m="http://schemas.openxmlformats.org/officeDocument/2006/math" xmlns:v="urn:schemas-microsoft-com:vml" xmlns:wp14="http://schemas.microsoft.com/office/word/2010/wordprocessingDrawing" xmlns:wp="http://schemas.openxmlformats.org/drawingml/2006/wordprocessingDrawing" xmlns:w10="urn:schemas-microsoft-com:office:word" xmlns:w="http://schemas.openxmlformats.org/wordprocessingml/2006/main" xmlns:w14="http://schemas.microsoft.com/office/word/2010/wordml" xmlns:w15="http://schemas.microsoft.com/office/word/2012/wordml" xmlns:w16cid="http://schemas.microsoft.com/office/word/2016/wordml/cid" xmlns:w16se="http://schemas.microsoft.com/office/word/2015/wordml/symex" xmlns:wpg="http://schemas.microsoft.com/office/word/2010/wordprocessingGroup" xmlns:wpi="http://schemas.microsoft.com/office/word/2010/wordprocessingInk" xmlns:wne="http://schemas.microsoft.com/office/word/2006/wordml" xmlns:wps="http://schemas.microsoft.com/office/word/2010/wordprocessingShape" mc:Ignorable="w14 w15 w16se w16cid wp14">
   <w:abstractNum w:abstractNumId="0" w15:restartNumberingAfterBreak="0">
     <w:nsid w:val="0475207B"/>
     <w:multiLevelType w:val="multilevel"/>
@@ -45885,100 +45912,100 @@
       </w:pPr>
     </w:lvl>
   </w:abstractNum>
-  <w:num w:numId="1" w16cid:durableId="165557224">
+  <w:num w:numId="1">
     <w:abstractNumId w:val="19"/>
   </w:num>
-  <w:num w:numId="2" w16cid:durableId="2068144073">
+  <w:num w:numId="2">
     <w:abstractNumId w:val="21"/>
   </w:num>
-  <w:num w:numId="3" w16cid:durableId="1377315231">
+  <w:num w:numId="3">
     <w:abstractNumId w:val="18"/>
   </w:num>
-  <w:num w:numId="4" w16cid:durableId="1252814781">
+  <w:num w:numId="4">
     <w:abstractNumId w:val="26"/>
   </w:num>
-  <w:num w:numId="5" w16cid:durableId="455025377">
+  <w:num w:numId="5">
     <w:abstractNumId w:val="30"/>
   </w:num>
-  <w:num w:numId="6" w16cid:durableId="1296256299">
+  <w:num w:numId="6">
     <w:abstractNumId w:val="3"/>
   </w:num>
-  <w:num w:numId="7" w16cid:durableId="1598324161">
+  <w:num w:numId="7">
     <w:abstractNumId w:val="2"/>
   </w:num>
-  <w:num w:numId="8" w16cid:durableId="1109395847">
+  <w:num w:numId="8">
     <w:abstractNumId w:val="25"/>
   </w:num>
-  <w:num w:numId="9" w16cid:durableId="925697500">
+  <w:num w:numId="9">
     <w:abstractNumId w:val="27"/>
   </w:num>
-  <w:num w:numId="10" w16cid:durableId="10841849">
+  <w:num w:numId="10">
     <w:abstractNumId w:val="1"/>
   </w:num>
-  <w:num w:numId="11" w16cid:durableId="1803305337">
+  <w:num w:numId="11">
     <w:abstractNumId w:val="29"/>
   </w:num>
-  <w:num w:numId="12" w16cid:durableId="2064328190">
+  <w:num w:numId="12">
     <w:abstractNumId w:val="5"/>
   </w:num>
-  <w:num w:numId="13" w16cid:durableId="1734692433">
+  <w:num w:numId="13">
     <w:abstractNumId w:val="12"/>
   </w:num>
-  <w:num w:numId="14" w16cid:durableId="88937654">
+  <w:num w:numId="14">
     <w:abstractNumId w:val="22"/>
   </w:num>
-  <w:num w:numId="15" w16cid:durableId="1408839774">
+  <w:num w:numId="15">
     <w:abstractNumId w:val="14"/>
   </w:num>
-  <w:num w:numId="16" w16cid:durableId="1081223102">
+  <w:num w:numId="16">
     <w:abstractNumId w:val="9"/>
   </w:num>
-  <w:num w:numId="17" w16cid:durableId="2089375850">
+  <w:num w:numId="17">
     <w:abstractNumId w:val="8"/>
   </w:num>
-  <w:num w:numId="18" w16cid:durableId="1594823750">
+  <w:num w:numId="18">
     <w:abstractNumId w:val="24"/>
   </w:num>
-  <w:num w:numId="19" w16cid:durableId="2059622742">
+  <w:num w:numId="19">
     <w:abstractNumId w:val="10"/>
   </w:num>
-  <w:num w:numId="20" w16cid:durableId="1156067461">
+  <w:num w:numId="20">
     <w:abstractNumId w:val="15"/>
   </w:num>
-  <w:num w:numId="21" w16cid:durableId="635530192">
+  <w:num w:numId="21">
     <w:abstractNumId w:val="0"/>
   </w:num>
-  <w:num w:numId="22" w16cid:durableId="1931739260">
+  <w:num w:numId="22">
     <w:abstractNumId w:val="17"/>
   </w:num>
-  <w:num w:numId="23" w16cid:durableId="1364090734">
+  <w:num w:numId="23">
     <w:abstractNumId w:val="11"/>
   </w:num>
-  <w:num w:numId="24" w16cid:durableId="1148010140">
+  <w:num w:numId="24">
     <w:abstractNumId w:val="23"/>
   </w:num>
-  <w:num w:numId="25" w16cid:durableId="1914732277">
+  <w:num w:numId="25">
     <w:abstractNumId w:val="28"/>
   </w:num>
-  <w:num w:numId="26" w16cid:durableId="1927035789">
+  <w:num w:numId="26">
     <w:abstractNumId w:val="16"/>
   </w:num>
-  <w:num w:numId="27" w16cid:durableId="1242982861">
+  <w:num w:numId="27">
     <w:abstractNumId w:val="7"/>
   </w:num>
-  <w:num w:numId="28" w16cid:durableId="1532961115">
+  <w:num w:numId="28">
     <w:abstractNumId w:val="31"/>
   </w:num>
-  <w:num w:numId="29" w16cid:durableId="1267424118">
+  <w:num w:numId="29">
     <w:abstractNumId w:val="4"/>
   </w:num>
-  <w:num w:numId="30" w16cid:durableId="1604336070">
+  <w:num w:numId="30">
     <w:abstractNumId w:val="6"/>
   </w:num>
-  <w:num w:numId="31" w16cid:durableId="1395469989">
+  <w:num w:numId="31">
     <w:abstractNumId w:val="13"/>
   </w:num>
-  <w:num w:numId="32" w16cid:durableId="1441677713">
+  <w:num w:numId="32">
     <w:abstractNumId w:val="20"/>
   </w:num>
   <w:numIdMacAtCleanup w:val="30"/>
@@ -45986,7 +46013,7 @@
 </file>
 
 <file path=word/styles.xml><?xml version="1.0" encoding="utf-8"?>
-<w:styles xmlns:mc="http://schemas.openxmlformats.org/markup-compatibility/2006" xmlns:r="http://schemas.openxmlformats.org/officeDocument/2006/relationships" xmlns:w="http://schemas.openxmlformats.org/wordprocessingml/2006/main" xmlns:w14="http://schemas.microsoft.com/office/word/2010/wordml" xmlns:w15="http://schemas.microsoft.com/office/word/2012/wordml" xmlns:w16cex="http://schemas.microsoft.com/office/word/2018/wordml/cex" xmlns:w16cid="http://schemas.microsoft.com/office/word/2016/wordml/cid" xmlns:w16="http://schemas.microsoft.com/office/word/2018/wordml" xmlns:w16du="http://schemas.microsoft.com/office/word/2023/wordml/word16du" xmlns:w16sdtdh="http://schemas.microsoft.com/office/word/2020/wordml/sdtdatahash" xmlns:w16sdtfl="http://schemas.microsoft.com/office/word/2024/wordml/sdtformatlock" xmlns:w16se="http://schemas.microsoft.com/office/word/2015/wordml/symex" mc:Ignorable="w14 w15 w16se w16cid w16 w16cex w16sdtdh w16sdtfl w16du">
+<w:styles xmlns:mc="http://schemas.openxmlformats.org/markup-compatibility/2006" xmlns:r="http://schemas.openxmlformats.org/officeDocument/2006/relationships" xmlns:w="http://schemas.openxmlformats.org/wordprocessingml/2006/main" xmlns:w14="http://schemas.microsoft.com/office/word/2010/wordml" xmlns:w15="http://schemas.microsoft.com/office/word/2012/wordml" xmlns:w16cid="http://schemas.microsoft.com/office/word/2016/wordml/cid" xmlns:w16se="http://schemas.microsoft.com/office/word/2015/wordml/symex" mc:Ignorable="w14 w15 w16se w16cid">
   <w:docDefaults>
     <w:rPrDefault>
       <w:rPr>
@@ -46002,7 +46029,7 @@
       </w:pPr>
     </w:pPrDefault>
   </w:docDefaults>
-  <w:latentStyles w:defLockedState="0" w:defUIPriority="99" w:defSemiHidden="0" w:defUnhideWhenUsed="0" w:defQFormat="0" w:count="376">
+  <w:latentStyles w:defLockedState="0" w:defUIPriority="99" w:defSemiHidden="0" w:defUnhideWhenUsed="0" w:defQFormat="0" w:count="375">
     <w:lsdException w:name="Normal" w:uiPriority="1" w:qFormat="1"/>
     <w:lsdException w:name="heading 1" w:uiPriority="1" w:qFormat="1"/>
     <w:lsdException w:name="heading 2" w:semiHidden="1" w:uiPriority="1" w:unhideWhenUsed="1" w:qFormat="1"/>
@@ -46378,7 +46405,6 @@
     <w:lsdException w:name="Smart Hyperlink" w:semiHidden="1" w:unhideWhenUsed="1"/>
     <w:lsdException w:name="Hashtag" w:semiHidden="1" w:unhideWhenUsed="1"/>
     <w:lsdException w:name="Unresolved Mention" w:semiHidden="1" w:unhideWhenUsed="1"/>
-    <w:lsdException w:name="Smart Link" w:semiHidden="1" w:unhideWhenUsed="1"/>
   </w:latentStyles>
   <w:style w:type="paragraph" w:default="1" w:styleId="Normal">
     <w:name w:val="Normal"/>
@@ -47173,7 +47199,7 @@
 </file>
 
 <file path=customXml/itemProps2.xml><?xml version="1.0" encoding="utf-8"?>
-<ds:datastoreItem xmlns:ds="http://schemas.openxmlformats.org/officeDocument/2006/customXml" ds:itemID="{1ED7AEB2-B5CA-466B-9BA5-87B83DCDC25D}">
+<ds:datastoreItem xmlns:ds="http://schemas.openxmlformats.org/officeDocument/2006/customXml" ds:itemID="{37C08B3A-572B-4838-B070-4F4DE577B37F}">
   <ds:schemaRefs>
     <ds:schemaRef ds:uri="http://schemas.openxmlformats.org/officeDocument/2006/bibliography"/>
   </ds:schemaRefs>

</xml_diff>